<commit_message>
Updated LOGBOOK upto Week 8
</commit_message>
<xml_diff>
--- a/BIT4133-NLP LOGBOOK.docx
+++ b/BIT4133-NLP LOGBOOK.docx
@@ -177,7 +177,15 @@
           <w:sz w:val="24"/>
           <w:szCs w:val="24"/>
         </w:rPr>
-        <w:t xml:space="preserve">Technologies Used: Python, NLTK, Scikit-learn, Google </w:t>
+        <w:t xml:space="preserve">Technologies Used: </w:t>
+      </w:r>
+      <w:r>
+        <w:rPr>
+          <w:rFonts w:ascii="Times New Roman" w:hAnsi="Times New Roman" w:cs="Times New Roman"/>
+          <w:sz w:val="24"/>
+          <w:szCs w:val="24"/>
+        </w:rPr>
+        <w:t xml:space="preserve">Python • NLTK • </w:t>
       </w:r>
       <w:proofErr w:type="spellStart"/>
       <w:r>
@@ -186,17 +194,45 @@
           <w:sz w:val="24"/>
           <w:szCs w:val="24"/>
         </w:rPr>
+        <w:t>spaCy</w:t>
+      </w:r>
+      <w:proofErr w:type="spellEnd"/>
+      <w:r>
+        <w:rPr>
+          <w:rFonts w:ascii="Times New Roman" w:hAnsi="Times New Roman" w:cs="Times New Roman"/>
+          <w:sz w:val="24"/>
+          <w:szCs w:val="24"/>
+        </w:rPr>
+        <w:t xml:space="preserve"> • </w:t>
+      </w:r>
+      <w:proofErr w:type="spellStart"/>
+      <w:r>
+        <w:rPr>
+          <w:rFonts w:ascii="Times New Roman" w:hAnsi="Times New Roman" w:cs="Times New Roman"/>
+          <w:sz w:val="24"/>
+          <w:szCs w:val="24"/>
+        </w:rPr>
+        <w:t>Gensim</w:t>
+      </w:r>
+      <w:proofErr w:type="spellEnd"/>
+      <w:r>
+        <w:rPr>
+          <w:rFonts w:ascii="Times New Roman" w:hAnsi="Times New Roman" w:cs="Times New Roman"/>
+          <w:sz w:val="24"/>
+          <w:szCs w:val="24"/>
+        </w:rPr>
+        <w:t xml:space="preserve"> • TensorFlow • Scikit-learn • Pandas • Matplotlib • Hugging Face Transformers • Google </w:t>
+      </w:r>
+      <w:proofErr w:type="spellStart"/>
+      <w:r>
+        <w:rPr>
+          <w:rFonts w:ascii="Times New Roman" w:hAnsi="Times New Roman" w:cs="Times New Roman"/>
+          <w:sz w:val="24"/>
+          <w:szCs w:val="24"/>
+        </w:rPr>
         <w:t>Colab</w:t>
       </w:r>
       <w:proofErr w:type="spellEnd"/>
-      <w:r>
-        <w:rPr>
-          <w:rFonts w:ascii="Times New Roman" w:hAnsi="Times New Roman" w:cs="Times New Roman"/>
-          <w:sz w:val="24"/>
-          <w:szCs w:val="24"/>
-        </w:rPr>
-        <w:t>, Pandas, Matplotlib</w:t>
-      </w:r>
     </w:p>
     <w:p>
       <w:pPr>
@@ -491,7 +527,7 @@
           <w:r>
             <w:fldChar w:fldCharType="separate"/>
           </w:r>
-          <w:hyperlink w:anchor="_Toc232646110" w:history="1">
+          <w:hyperlink w:anchor="_Toc233315754" w:history="1">
             <w:r>
               <w:rPr>
                 <w:rStyle w:val="Hyperlink"/>
@@ -520,7 +556,7 @@
                 <w:noProof/>
                 <w:webHidden/>
               </w:rPr>
-              <w:instrText xml:space="preserve"> PAGEREF _Toc232646110 \h </w:instrText>
+              <w:instrText xml:space="preserve"> PAGEREF _Toc233315754 \h </w:instrText>
             </w:r>
             <w:r>
               <w:rPr>
@@ -567,7 +603,7 @@
               <w14:ligatures w14:val="standardContextual"/>
             </w:rPr>
           </w:pPr>
-          <w:hyperlink w:anchor="_Toc232646111" w:history="1">
+          <w:hyperlink w:anchor="_Toc233315755" w:history="1">
             <w:r>
               <w:rPr>
                 <w:rStyle w:val="Hyperlink"/>
@@ -595,7 +631,7 @@
                 <w:noProof/>
                 <w:webHidden/>
               </w:rPr>
-              <w:instrText xml:space="preserve"> PAGEREF _Toc232646111 \h </w:instrText>
+              <w:instrText xml:space="preserve"> PAGEREF _Toc233315755 \h </w:instrText>
             </w:r>
             <w:r>
               <w:rPr>
@@ -642,7 +678,7 @@
               <w14:ligatures w14:val="standardContextual"/>
             </w:rPr>
           </w:pPr>
-          <w:hyperlink w:anchor="_Toc232646112" w:history="1">
+          <w:hyperlink w:anchor="_Toc233315756" w:history="1">
             <w:r>
               <w:rPr>
                 <w:rStyle w:val="Hyperlink"/>
@@ -670,7 +706,7 @@
                 <w:noProof/>
                 <w:webHidden/>
               </w:rPr>
-              <w:instrText xml:space="preserve"> PAGEREF _Toc232646112 \h </w:instrText>
+              <w:instrText xml:space="preserve"> PAGEREF _Toc233315756 \h </w:instrText>
             </w:r>
             <w:r>
               <w:rPr>
@@ -717,7 +753,7 @@
               <w14:ligatures w14:val="standardContextual"/>
             </w:rPr>
           </w:pPr>
-          <w:hyperlink w:anchor="_Toc232646113" w:history="1">
+          <w:hyperlink w:anchor="_Toc233315757" w:history="1">
             <w:r>
               <w:rPr>
                 <w:rStyle w:val="Hyperlink"/>
@@ -745,7 +781,7 @@
                 <w:noProof/>
                 <w:webHidden/>
               </w:rPr>
-              <w:instrText xml:space="preserve"> PAGEREF _Toc232646113 \h </w:instrText>
+              <w:instrText xml:space="preserve"> PAGEREF _Toc233315757 \h </w:instrText>
             </w:r>
             <w:r>
               <w:rPr>
@@ -792,7 +828,7 @@
               <w14:ligatures w14:val="standardContextual"/>
             </w:rPr>
           </w:pPr>
-          <w:hyperlink w:anchor="_Toc232646114" w:history="1">
+          <w:hyperlink w:anchor="_Toc233315758" w:history="1">
             <w:r>
               <w:rPr>
                 <w:rStyle w:val="Hyperlink"/>
@@ -820,7 +856,7 @@
                 <w:noProof/>
                 <w:webHidden/>
               </w:rPr>
-              <w:instrText xml:space="preserve"> PAGEREF _Toc232646114 \h </w:instrText>
+              <w:instrText xml:space="preserve"> PAGEREF _Toc233315758 \h </w:instrText>
             </w:r>
             <w:r>
               <w:rPr>
@@ -867,7 +903,7 @@
               <w14:ligatures w14:val="standardContextual"/>
             </w:rPr>
           </w:pPr>
-          <w:hyperlink w:anchor="_Toc232646115" w:history="1">
+          <w:hyperlink w:anchor="_Toc233315759" w:history="1">
             <w:r>
               <w:rPr>
                 <w:rStyle w:val="Hyperlink"/>
@@ -895,7 +931,7 @@
                 <w:noProof/>
                 <w:webHidden/>
               </w:rPr>
-              <w:instrText xml:space="preserve"> PAGEREF _Toc232646115 \h </w:instrText>
+              <w:instrText xml:space="preserve"> PAGEREF _Toc233315759 \h </w:instrText>
             </w:r>
             <w:r>
               <w:rPr>
@@ -915,7 +951,7 @@
                 <w:noProof/>
                 <w:webHidden/>
               </w:rPr>
-              <w:t>5</w:t>
+              <w:t>6</w:t>
             </w:r>
             <w:r>
               <w:rPr>
@@ -942,7 +978,7 @@
               <w14:ligatures w14:val="standardContextual"/>
             </w:rPr>
           </w:pPr>
-          <w:hyperlink w:anchor="_Toc232646116" w:history="1">
+          <w:hyperlink w:anchor="_Toc233315760" w:history="1">
             <w:r>
               <w:rPr>
                 <w:rStyle w:val="Hyperlink"/>
@@ -970,7 +1006,7 @@
                 <w:noProof/>
                 <w:webHidden/>
               </w:rPr>
-              <w:instrText xml:space="preserve"> PAGEREF _Toc232646116 \h </w:instrText>
+              <w:instrText xml:space="preserve"> PAGEREF _Toc233315760 \h </w:instrText>
             </w:r>
             <w:r>
               <w:rPr>
@@ -1017,7 +1053,7 @@
               <w14:ligatures w14:val="standardContextual"/>
             </w:rPr>
           </w:pPr>
-          <w:hyperlink w:anchor="_Toc232646117" w:history="1">
+          <w:hyperlink w:anchor="_Toc233315761" w:history="1">
             <w:r>
               <w:rPr>
                 <w:rStyle w:val="Hyperlink"/>
@@ -1046,7 +1082,7 @@
                 <w:noProof/>
                 <w:webHidden/>
               </w:rPr>
-              <w:instrText xml:space="preserve"> PAGEREF _Toc232646117 \h </w:instrText>
+              <w:instrText xml:space="preserve"> PAGEREF _Toc233315761 \h </w:instrText>
             </w:r>
             <w:r>
               <w:rPr>
@@ -1066,7 +1102,7 @@
                 <w:noProof/>
                 <w:webHidden/>
               </w:rPr>
-              <w:t>6</w:t>
+              <w:t>7</w:t>
             </w:r>
             <w:r>
               <w:rPr>
@@ -1093,7 +1129,7 @@
               <w14:ligatures w14:val="standardContextual"/>
             </w:rPr>
           </w:pPr>
-          <w:hyperlink w:anchor="_Toc232646118" w:history="1">
+          <w:hyperlink w:anchor="_Toc233315762" w:history="1">
             <w:r>
               <w:rPr>
                 <w:rStyle w:val="Hyperlink"/>
@@ -1121,7 +1157,7 @@
                 <w:noProof/>
                 <w:webHidden/>
               </w:rPr>
-              <w:instrText xml:space="preserve"> PAGEREF _Toc232646118 \h </w:instrText>
+              <w:instrText xml:space="preserve"> PAGEREF _Toc233315762 \h </w:instrText>
             </w:r>
             <w:r>
               <w:rPr>
@@ -1141,7 +1177,7 @@
                 <w:noProof/>
                 <w:webHidden/>
               </w:rPr>
-              <w:t>6</w:t>
+              <w:t>7</w:t>
             </w:r>
             <w:r>
               <w:rPr>
@@ -1168,7 +1204,7 @@
               <w14:ligatures w14:val="standardContextual"/>
             </w:rPr>
           </w:pPr>
-          <w:hyperlink w:anchor="_Toc232646119" w:history="1">
+          <w:hyperlink w:anchor="_Toc233315763" w:history="1">
             <w:r>
               <w:rPr>
                 <w:rStyle w:val="Hyperlink"/>
@@ -1196,7 +1232,7 @@
                 <w:noProof/>
                 <w:webHidden/>
               </w:rPr>
-              <w:instrText xml:space="preserve"> PAGEREF _Toc232646119 \h </w:instrText>
+              <w:instrText xml:space="preserve"> PAGEREF _Toc233315763 \h </w:instrText>
             </w:r>
             <w:r>
               <w:rPr>
@@ -1216,7 +1252,7 @@
                 <w:noProof/>
                 <w:webHidden/>
               </w:rPr>
-              <w:t>7</w:t>
+              <w:t>8</w:t>
             </w:r>
             <w:r>
               <w:rPr>
@@ -1243,7 +1279,7 @@
               <w14:ligatures w14:val="standardContextual"/>
             </w:rPr>
           </w:pPr>
-          <w:hyperlink w:anchor="_Toc232646120" w:history="1">
+          <w:hyperlink w:anchor="_Toc233315764" w:history="1">
             <w:r>
               <w:rPr>
                 <w:rStyle w:val="Hyperlink"/>
@@ -1271,7 +1307,7 @@
                 <w:noProof/>
                 <w:webHidden/>
               </w:rPr>
-              <w:instrText xml:space="preserve"> PAGEREF _Toc232646120 \h </w:instrText>
+              <w:instrText xml:space="preserve"> PAGEREF _Toc233315764 \h </w:instrText>
             </w:r>
             <w:r>
               <w:rPr>
@@ -1291,7 +1327,7 @@
                 <w:noProof/>
                 <w:webHidden/>
               </w:rPr>
-              <w:t>8</w:t>
+              <w:t>9</w:t>
             </w:r>
             <w:r>
               <w:rPr>
@@ -1318,7 +1354,7 @@
               <w14:ligatures w14:val="standardContextual"/>
             </w:rPr>
           </w:pPr>
-          <w:hyperlink w:anchor="_Toc232646121" w:history="1">
+          <w:hyperlink w:anchor="_Toc233315765" w:history="1">
             <w:r>
               <w:rPr>
                 <w:rStyle w:val="Hyperlink"/>
@@ -1346,7 +1382,7 @@
                 <w:noProof/>
                 <w:webHidden/>
               </w:rPr>
-              <w:instrText xml:space="preserve"> PAGEREF _Toc232646121 \h </w:instrText>
+              <w:instrText xml:space="preserve"> PAGEREF _Toc233315765 \h </w:instrText>
             </w:r>
             <w:r>
               <w:rPr>
@@ -1366,7 +1402,7 @@
                 <w:noProof/>
                 <w:webHidden/>
               </w:rPr>
-              <w:t>8</w:t>
+              <w:t>9</w:t>
             </w:r>
             <w:r>
               <w:rPr>
@@ -1393,7 +1429,7 @@
               <w14:ligatures w14:val="standardContextual"/>
             </w:rPr>
           </w:pPr>
-          <w:hyperlink w:anchor="_Toc232646122" w:history="1">
+          <w:hyperlink w:anchor="_Toc233315766" w:history="1">
             <w:r>
               <w:rPr>
                 <w:rStyle w:val="Hyperlink"/>
@@ -1422,7 +1458,7 @@
                 <w:noProof/>
                 <w:webHidden/>
               </w:rPr>
-              <w:instrText xml:space="preserve"> PAGEREF _Toc232646122 \h </w:instrText>
+              <w:instrText xml:space="preserve"> PAGEREF _Toc233315766 \h </w:instrText>
             </w:r>
             <w:r>
               <w:rPr>
@@ -1442,7 +1478,7 @@
                 <w:noProof/>
                 <w:webHidden/>
               </w:rPr>
-              <w:t>9</w:t>
+              <w:t>10</w:t>
             </w:r>
             <w:r>
               <w:rPr>
@@ -1469,7 +1505,7 @@
               <w14:ligatures w14:val="standardContextual"/>
             </w:rPr>
           </w:pPr>
-          <w:hyperlink w:anchor="_Toc232646123" w:history="1">
+          <w:hyperlink w:anchor="_Toc233315767" w:history="1">
             <w:r>
               <w:rPr>
                 <w:rStyle w:val="Hyperlink"/>
@@ -1497,7 +1533,7 @@
                 <w:noProof/>
                 <w:webHidden/>
               </w:rPr>
-              <w:instrText xml:space="preserve"> PAGEREF _Toc232646123 \h </w:instrText>
+              <w:instrText xml:space="preserve"> PAGEREF _Toc233315767 \h </w:instrText>
             </w:r>
             <w:r>
               <w:rPr>
@@ -1517,7 +1553,7 @@
                 <w:noProof/>
                 <w:webHidden/>
               </w:rPr>
-              <w:t>9</w:t>
+              <w:t>10</w:t>
             </w:r>
             <w:r>
               <w:rPr>
@@ -1544,7 +1580,7 @@
               <w14:ligatures w14:val="standardContextual"/>
             </w:rPr>
           </w:pPr>
-          <w:hyperlink w:anchor="_Toc232646124" w:history="1">
+          <w:hyperlink w:anchor="_Toc233315768" w:history="1">
             <w:r>
               <w:rPr>
                 <w:rStyle w:val="Hyperlink"/>
@@ -1572,7 +1608,7 @@
                 <w:noProof/>
                 <w:webHidden/>
               </w:rPr>
-              <w:instrText xml:space="preserve"> PAGEREF _Toc232646124 \h </w:instrText>
+              <w:instrText xml:space="preserve"> PAGEREF _Toc233315768 \h </w:instrText>
             </w:r>
             <w:r>
               <w:rPr>
@@ -1592,7 +1628,7 @@
                 <w:noProof/>
                 <w:webHidden/>
               </w:rPr>
-              <w:t>10</w:t>
+              <w:t>11</w:t>
             </w:r>
             <w:r>
               <w:rPr>
@@ -1619,7 +1655,7 @@
               <w14:ligatures w14:val="standardContextual"/>
             </w:rPr>
           </w:pPr>
-          <w:hyperlink w:anchor="_Toc232646125" w:history="1">
+          <w:hyperlink w:anchor="_Toc233315769" w:history="1">
             <w:r>
               <w:rPr>
                 <w:rStyle w:val="Hyperlink"/>
@@ -1647,7 +1683,7 @@
                 <w:noProof/>
                 <w:webHidden/>
               </w:rPr>
-              <w:instrText xml:space="preserve"> PAGEREF _Toc232646125 \h </w:instrText>
+              <w:instrText xml:space="preserve"> PAGEREF _Toc233315769 \h </w:instrText>
             </w:r>
             <w:r>
               <w:rPr>
@@ -1667,7 +1703,7 @@
                 <w:noProof/>
                 <w:webHidden/>
               </w:rPr>
-              <w:t>10</w:t>
+              <w:t>11</w:t>
             </w:r>
             <w:r>
               <w:rPr>
@@ -1694,7 +1730,7 @@
               <w14:ligatures w14:val="standardContextual"/>
             </w:rPr>
           </w:pPr>
-          <w:hyperlink w:anchor="_Toc232646126" w:history="1">
+          <w:hyperlink w:anchor="_Toc233315770" w:history="1">
             <w:r>
               <w:rPr>
                 <w:rStyle w:val="Hyperlink"/>
@@ -1722,7 +1758,7 @@
                 <w:noProof/>
                 <w:webHidden/>
               </w:rPr>
-              <w:instrText xml:space="preserve"> PAGEREF _Toc232646126 \h </w:instrText>
+              <w:instrText xml:space="preserve"> PAGEREF _Toc233315770 \h </w:instrText>
             </w:r>
             <w:r>
               <w:rPr>
@@ -1742,7 +1778,7 @@
                 <w:noProof/>
                 <w:webHidden/>
               </w:rPr>
-              <w:t>11</w:t>
+              <w:t>12</w:t>
             </w:r>
             <w:r>
               <w:rPr>
@@ -1769,7 +1805,7 @@
               <w14:ligatures w14:val="standardContextual"/>
             </w:rPr>
           </w:pPr>
-          <w:hyperlink w:anchor="_Toc232646127" w:history="1">
+          <w:hyperlink w:anchor="_Toc233315771" w:history="1">
             <w:r>
               <w:rPr>
                 <w:rStyle w:val="Hyperlink"/>
@@ -1798,7 +1834,7 @@
                 <w:noProof/>
                 <w:webHidden/>
               </w:rPr>
-              <w:instrText xml:space="preserve"> PAGEREF _Toc232646127 \h </w:instrText>
+              <w:instrText xml:space="preserve"> PAGEREF _Toc233315771 \h </w:instrText>
             </w:r>
             <w:r>
               <w:rPr>
@@ -1818,7 +1854,7 @@
                 <w:noProof/>
                 <w:webHidden/>
               </w:rPr>
-              <w:t>12</w:t>
+              <w:t>13</w:t>
             </w:r>
             <w:r>
               <w:rPr>
@@ -1845,7 +1881,7 @@
               <w14:ligatures w14:val="standardContextual"/>
             </w:rPr>
           </w:pPr>
-          <w:hyperlink w:anchor="_Toc232646128" w:history="1">
+          <w:hyperlink w:anchor="_Toc233315772" w:history="1">
             <w:r>
               <w:rPr>
                 <w:rStyle w:val="Hyperlink"/>
@@ -1873,7 +1909,7 @@
                 <w:noProof/>
                 <w:webHidden/>
               </w:rPr>
-              <w:instrText xml:space="preserve"> PAGEREF _Toc232646128 \h </w:instrText>
+              <w:instrText xml:space="preserve"> PAGEREF _Toc233315772 \h </w:instrText>
             </w:r>
             <w:r>
               <w:rPr>
@@ -1893,7 +1929,7 @@
                 <w:noProof/>
                 <w:webHidden/>
               </w:rPr>
-              <w:t>12</w:t>
+              <w:t>13</w:t>
             </w:r>
             <w:r>
               <w:rPr>
@@ -1920,7 +1956,7 @@
               <w14:ligatures w14:val="standardContextual"/>
             </w:rPr>
           </w:pPr>
-          <w:hyperlink w:anchor="_Toc232646129" w:history="1">
+          <w:hyperlink w:anchor="_Toc233315773" w:history="1">
             <w:r>
               <w:rPr>
                 <w:rStyle w:val="Hyperlink"/>
@@ -1948,7 +1984,7 @@
                 <w:noProof/>
                 <w:webHidden/>
               </w:rPr>
-              <w:instrText xml:space="preserve"> PAGEREF _Toc232646129 \h </w:instrText>
+              <w:instrText xml:space="preserve"> PAGEREF _Toc233315773 \h </w:instrText>
             </w:r>
             <w:r>
               <w:rPr>
@@ -1968,7 +2004,7 @@
                 <w:noProof/>
                 <w:webHidden/>
               </w:rPr>
-              <w:t>12</w:t>
+              <w:t>13</w:t>
             </w:r>
             <w:r>
               <w:rPr>
@@ -1995,7 +2031,7 @@
               <w14:ligatures w14:val="standardContextual"/>
             </w:rPr>
           </w:pPr>
-          <w:hyperlink w:anchor="_Toc232646130" w:history="1">
+          <w:hyperlink w:anchor="_Toc233315774" w:history="1">
             <w:r>
               <w:rPr>
                 <w:rStyle w:val="Hyperlink"/>
@@ -2023,7 +2059,7 @@
                 <w:noProof/>
                 <w:webHidden/>
               </w:rPr>
-              <w:instrText xml:space="preserve"> PAGEREF _Toc232646130 \h </w:instrText>
+              <w:instrText xml:space="preserve"> PAGEREF _Toc233315774 \h </w:instrText>
             </w:r>
             <w:r>
               <w:rPr>
@@ -2043,7 +2079,7 @@
                 <w:noProof/>
                 <w:webHidden/>
               </w:rPr>
-              <w:t>13</w:t>
+              <w:t>14</w:t>
             </w:r>
             <w:r>
               <w:rPr>
@@ -2070,7 +2106,7 @@
               <w14:ligatures w14:val="standardContextual"/>
             </w:rPr>
           </w:pPr>
-          <w:hyperlink w:anchor="_Toc232646131" w:history="1">
+          <w:hyperlink w:anchor="_Toc233315775" w:history="1">
             <w:r>
               <w:rPr>
                 <w:rStyle w:val="Hyperlink"/>
@@ -2098,7 +2134,7 @@
                 <w:noProof/>
                 <w:webHidden/>
               </w:rPr>
-              <w:instrText xml:space="preserve"> PAGEREF _Toc232646131 \h </w:instrText>
+              <w:instrText xml:space="preserve"> PAGEREF _Toc233315775 \h </w:instrText>
             </w:r>
             <w:r>
               <w:rPr>
@@ -2118,7 +2154,7 @@
                 <w:noProof/>
                 <w:webHidden/>
               </w:rPr>
-              <w:t>14</w:t>
+              <w:t>15</w:t>
             </w:r>
             <w:r>
               <w:rPr>
@@ -2145,7 +2181,7 @@
               <w14:ligatures w14:val="standardContextual"/>
             </w:rPr>
           </w:pPr>
-          <w:hyperlink w:anchor="_Toc232646132" w:history="1">
+          <w:hyperlink w:anchor="_Toc233315776" w:history="1">
             <w:r>
               <w:rPr>
                 <w:rStyle w:val="Hyperlink"/>
@@ -2173,7 +2209,7 @@
                 <w:noProof/>
                 <w:webHidden/>
               </w:rPr>
-              <w:instrText xml:space="preserve"> PAGEREF _Toc232646132 \h </w:instrText>
+              <w:instrText xml:space="preserve"> PAGEREF _Toc233315776 \h </w:instrText>
             </w:r>
             <w:r>
               <w:rPr>
@@ -2193,7 +2229,7 @@
                 <w:noProof/>
                 <w:webHidden/>
               </w:rPr>
-              <w:t>14</w:t>
+              <w:t>15</w:t>
             </w:r>
             <w:r>
               <w:rPr>
@@ -2220,7 +2256,7 @@
               <w14:ligatures w14:val="standardContextual"/>
             </w:rPr>
           </w:pPr>
-          <w:hyperlink w:anchor="_Toc232646133" w:history="1">
+          <w:hyperlink w:anchor="_Toc233315777" w:history="1">
             <w:r>
               <w:rPr>
                 <w:rStyle w:val="Hyperlink"/>
@@ -2248,7 +2284,7 @@
                 <w:noProof/>
                 <w:webHidden/>
               </w:rPr>
-              <w:instrText xml:space="preserve"> PAGEREF _Toc232646133 \h </w:instrText>
+              <w:instrText xml:space="preserve"> PAGEREF _Toc233315777 \h </w:instrText>
             </w:r>
             <w:r>
               <w:rPr>
@@ -2268,7 +2304,7 @@
                 <w:noProof/>
                 <w:webHidden/>
               </w:rPr>
-              <w:t>15</w:t>
+              <w:t>16</w:t>
             </w:r>
             <w:r>
               <w:rPr>
@@ -2295,7 +2331,7 @@
               <w14:ligatures w14:val="standardContextual"/>
             </w:rPr>
           </w:pPr>
-          <w:hyperlink w:anchor="_Toc232646134" w:history="1">
+          <w:hyperlink w:anchor="_Toc233315778" w:history="1">
             <w:r>
               <w:rPr>
                 <w:rStyle w:val="Hyperlink"/>
@@ -2324,7 +2360,7 @@
                 <w:noProof/>
                 <w:webHidden/>
               </w:rPr>
-              <w:instrText xml:space="preserve"> PAGEREF _Toc232646134 \h </w:instrText>
+              <w:instrText xml:space="preserve"> PAGEREF _Toc233315778 \h </w:instrText>
             </w:r>
             <w:r>
               <w:rPr>
@@ -2344,7 +2380,7 @@
                 <w:noProof/>
                 <w:webHidden/>
               </w:rPr>
-              <w:t>16</w:t>
+              <w:t>17</w:t>
             </w:r>
             <w:r>
               <w:rPr>
@@ -2371,7 +2407,7 @@
               <w14:ligatures w14:val="standardContextual"/>
             </w:rPr>
           </w:pPr>
-          <w:hyperlink w:anchor="_Toc232646135" w:history="1">
+          <w:hyperlink w:anchor="_Toc233315779" w:history="1">
             <w:r>
               <w:rPr>
                 <w:rStyle w:val="Hyperlink"/>
@@ -2399,7 +2435,7 @@
                 <w:noProof/>
                 <w:webHidden/>
               </w:rPr>
-              <w:instrText xml:space="preserve"> PAGEREF _Toc232646135 \h </w:instrText>
+              <w:instrText xml:space="preserve"> PAGEREF _Toc233315779 \h </w:instrText>
             </w:r>
             <w:r>
               <w:rPr>
@@ -2419,7 +2455,7 @@
                 <w:noProof/>
                 <w:webHidden/>
               </w:rPr>
-              <w:t>18</w:t>
+              <w:t>19</w:t>
             </w:r>
             <w:r>
               <w:rPr>
@@ -2446,7 +2482,7 @@
               <w14:ligatures w14:val="standardContextual"/>
             </w:rPr>
           </w:pPr>
-          <w:hyperlink w:anchor="_Toc232646136" w:history="1">
+          <w:hyperlink w:anchor="_Toc233315780" w:history="1">
             <w:r>
               <w:rPr>
                 <w:rStyle w:val="Hyperlink"/>
@@ -2474,7 +2510,7 @@
                 <w:noProof/>
                 <w:webHidden/>
               </w:rPr>
-              <w:instrText xml:space="preserve"> PAGEREF _Toc232646136 \h </w:instrText>
+              <w:instrText xml:space="preserve"> PAGEREF _Toc233315780 \h </w:instrText>
             </w:r>
             <w:r>
               <w:rPr>
@@ -2494,7 +2530,7 @@
                 <w:noProof/>
                 <w:webHidden/>
               </w:rPr>
-              <w:t>18</w:t>
+              <w:t>19</w:t>
             </w:r>
             <w:r>
               <w:rPr>
@@ -2521,7 +2557,7 @@
               <w14:ligatures w14:val="standardContextual"/>
             </w:rPr>
           </w:pPr>
-          <w:hyperlink w:anchor="_Toc232646137" w:history="1">
+          <w:hyperlink w:anchor="_Toc233315781" w:history="1">
             <w:r>
               <w:rPr>
                 <w:rStyle w:val="Hyperlink"/>
@@ -2549,7 +2585,7 @@
                 <w:noProof/>
                 <w:webHidden/>
               </w:rPr>
-              <w:instrText xml:space="preserve"> PAGEREF _Toc232646137 \h </w:instrText>
+              <w:instrText xml:space="preserve"> PAGEREF _Toc233315781 \h </w:instrText>
             </w:r>
             <w:r>
               <w:rPr>
@@ -2569,7 +2605,7 @@
                 <w:noProof/>
                 <w:webHidden/>
               </w:rPr>
-              <w:t>19</w:t>
+              <w:t>20</w:t>
             </w:r>
             <w:r>
               <w:rPr>
@@ -2596,7 +2632,7 @@
               <w14:ligatures w14:val="standardContextual"/>
             </w:rPr>
           </w:pPr>
-          <w:hyperlink w:anchor="_Toc232646138" w:history="1">
+          <w:hyperlink w:anchor="_Toc233315782" w:history="1">
             <w:r>
               <w:rPr>
                 <w:rStyle w:val="Hyperlink"/>
@@ -2624,7 +2660,7 @@
                 <w:noProof/>
                 <w:webHidden/>
               </w:rPr>
-              <w:instrText xml:space="preserve"> PAGEREF _Toc232646138 \h </w:instrText>
+              <w:instrText xml:space="preserve"> PAGEREF _Toc233315782 \h </w:instrText>
             </w:r>
             <w:r>
               <w:rPr>
@@ -2644,7 +2680,7 @@
                 <w:noProof/>
                 <w:webHidden/>
               </w:rPr>
-              <w:t>19</w:t>
+              <w:t>20</w:t>
             </w:r>
             <w:r>
               <w:rPr>
@@ -2671,7 +2707,7 @@
               <w14:ligatures w14:val="standardContextual"/>
             </w:rPr>
           </w:pPr>
-          <w:hyperlink w:anchor="_Toc232646139" w:history="1">
+          <w:hyperlink w:anchor="_Toc233315783" w:history="1">
             <w:r>
               <w:rPr>
                 <w:rStyle w:val="Hyperlink"/>
@@ -2701,7 +2737,7 @@
                 <w:noProof/>
                 <w:webHidden/>
               </w:rPr>
-              <w:instrText xml:space="preserve"> PAGEREF _Toc232646139 \h </w:instrText>
+              <w:instrText xml:space="preserve"> PAGEREF _Toc233315783 \h </w:instrText>
             </w:r>
             <w:r>
               <w:rPr>
@@ -2721,7 +2757,7 @@
                 <w:noProof/>
                 <w:webHidden/>
               </w:rPr>
-              <w:t>20</w:t>
+              <w:t>21</w:t>
             </w:r>
             <w:r>
               <w:rPr>
@@ -2748,7 +2784,7 @@
               <w14:ligatures w14:val="standardContextual"/>
             </w:rPr>
           </w:pPr>
-          <w:hyperlink w:anchor="_Toc232646140" w:history="1">
+          <w:hyperlink w:anchor="_Toc233315784" w:history="1">
             <w:r>
               <w:rPr>
                 <w:rStyle w:val="Hyperlink"/>
@@ -2777,7 +2813,7 @@
                 <w:noProof/>
                 <w:webHidden/>
               </w:rPr>
-              <w:instrText xml:space="preserve"> PAGEREF _Toc232646140 \h </w:instrText>
+              <w:instrText xml:space="preserve"> PAGEREF _Toc233315784 \h </w:instrText>
             </w:r>
             <w:r>
               <w:rPr>
@@ -2797,7 +2833,7 @@
                 <w:noProof/>
                 <w:webHidden/>
               </w:rPr>
-              <w:t>20</w:t>
+              <w:t>21</w:t>
             </w:r>
             <w:r>
               <w:rPr>
@@ -2824,7 +2860,7 @@
               <w14:ligatures w14:val="standardContextual"/>
             </w:rPr>
           </w:pPr>
-          <w:hyperlink w:anchor="_Toc232646141" w:history="1">
+          <w:hyperlink w:anchor="_Toc233315785" w:history="1">
             <w:r>
               <w:rPr>
                 <w:rStyle w:val="Hyperlink"/>
@@ -2853,7 +2889,7 @@
                 <w:noProof/>
                 <w:webHidden/>
               </w:rPr>
-              <w:instrText xml:space="preserve"> PAGEREF _Toc232646141 \h </w:instrText>
+              <w:instrText xml:space="preserve"> PAGEREF _Toc233315785 \h </w:instrText>
             </w:r>
             <w:r>
               <w:rPr>
@@ -2873,7 +2909,7 @@
                 <w:noProof/>
                 <w:webHidden/>
               </w:rPr>
-              <w:t>20</w:t>
+              <w:t>21</w:t>
             </w:r>
             <w:r>
               <w:rPr>
@@ -2900,7 +2936,7 @@
               <w14:ligatures w14:val="standardContextual"/>
             </w:rPr>
           </w:pPr>
-          <w:hyperlink w:anchor="_Toc232646142" w:history="1">
+          <w:hyperlink w:anchor="_Toc233315786" w:history="1">
             <w:r>
               <w:rPr>
                 <w:rStyle w:val="Hyperlink"/>
@@ -2929,7 +2965,7 @@
                 <w:noProof/>
                 <w:webHidden/>
               </w:rPr>
-              <w:instrText xml:space="preserve"> PAGEREF _Toc232646142 \h </w:instrText>
+              <w:instrText xml:space="preserve"> PAGEREF _Toc233315786 \h </w:instrText>
             </w:r>
             <w:r>
               <w:rPr>
@@ -2949,7 +2985,7 @@
                 <w:noProof/>
                 <w:webHidden/>
               </w:rPr>
-              <w:t>21</w:t>
+              <w:t>22</w:t>
             </w:r>
             <w:r>
               <w:rPr>
@@ -2976,7 +3012,7 @@
               <w14:ligatures w14:val="standardContextual"/>
             </w:rPr>
           </w:pPr>
-          <w:hyperlink w:anchor="_Toc232646143" w:history="1">
+          <w:hyperlink w:anchor="_Toc233315787" w:history="1">
             <w:r>
               <w:rPr>
                 <w:rStyle w:val="Hyperlink"/>
@@ -3005,7 +3041,7 @@
                 <w:noProof/>
                 <w:webHidden/>
               </w:rPr>
-              <w:instrText xml:space="preserve"> PAGEREF _Toc232646143 \h </w:instrText>
+              <w:instrText xml:space="preserve"> PAGEREF _Toc233315787 \h </w:instrText>
             </w:r>
             <w:r>
               <w:rPr>
@@ -3025,7 +3061,7 @@
                 <w:noProof/>
                 <w:webHidden/>
               </w:rPr>
-              <w:t>21</w:t>
+              <w:t>22</w:t>
             </w:r>
             <w:r>
               <w:rPr>
@@ -3052,7 +3088,7 @@
               <w14:ligatures w14:val="standardContextual"/>
             </w:rPr>
           </w:pPr>
-          <w:hyperlink w:anchor="_Toc232646144" w:history="1">
+          <w:hyperlink w:anchor="_Toc233315788" w:history="1">
             <w:r>
               <w:rPr>
                 <w:rStyle w:val="Hyperlink"/>
@@ -3081,7 +3117,7 @@
                 <w:noProof/>
                 <w:webHidden/>
               </w:rPr>
-              <w:instrText xml:space="preserve"> PAGEREF _Toc232646144 \h </w:instrText>
+              <w:instrText xml:space="preserve"> PAGEREF _Toc233315788 \h </w:instrText>
             </w:r>
             <w:r>
               <w:rPr>
@@ -3101,7 +3137,7 @@
                 <w:noProof/>
                 <w:webHidden/>
               </w:rPr>
-              <w:t>22</w:t>
+              <w:t>23</w:t>
             </w:r>
             <w:r>
               <w:rPr>
@@ -3128,7 +3164,7 @@
               <w14:ligatures w14:val="standardContextual"/>
             </w:rPr>
           </w:pPr>
-          <w:hyperlink w:anchor="_Toc232646145" w:history="1">
+          <w:hyperlink w:anchor="_Toc233315789" w:history="1">
             <w:r>
               <w:rPr>
                 <w:rStyle w:val="Hyperlink"/>
@@ -3157,7 +3193,7 @@
                 <w:noProof/>
                 <w:webHidden/>
               </w:rPr>
-              <w:instrText xml:space="preserve"> PAGEREF _Toc232646145 \h </w:instrText>
+              <w:instrText xml:space="preserve"> PAGEREF _Toc233315789 \h </w:instrText>
             </w:r>
             <w:r>
               <w:rPr>
@@ -3177,7 +3213,7 @@
                 <w:noProof/>
                 <w:webHidden/>
               </w:rPr>
-              <w:t>22</w:t>
+              <w:t>23</w:t>
             </w:r>
             <w:r>
               <w:rPr>
@@ -3204,7 +3240,7 @@
               <w14:ligatures w14:val="standardContextual"/>
             </w:rPr>
           </w:pPr>
-          <w:hyperlink w:anchor="_Toc232646146" w:history="1">
+          <w:hyperlink w:anchor="_Toc233315790" w:history="1">
             <w:r>
               <w:rPr>
                 <w:rStyle w:val="Hyperlink"/>
@@ -3233,7 +3269,7 @@
                 <w:noProof/>
                 <w:webHidden/>
               </w:rPr>
-              <w:instrText xml:space="preserve"> PAGEREF _Toc232646146 \h </w:instrText>
+              <w:instrText xml:space="preserve"> PAGEREF _Toc233315790 \h </w:instrText>
             </w:r>
             <w:r>
               <w:rPr>
@@ -3253,7 +3289,7 @@
                 <w:noProof/>
                 <w:webHidden/>
               </w:rPr>
-              <w:t>22</w:t>
+              <w:t>23</w:t>
             </w:r>
             <w:r>
               <w:rPr>
@@ -3280,7 +3316,7 @@
               <w14:ligatures w14:val="standardContextual"/>
             </w:rPr>
           </w:pPr>
-          <w:hyperlink w:anchor="_Toc232646147" w:history="1">
+          <w:hyperlink w:anchor="_Toc233315791" w:history="1">
             <w:r>
               <w:rPr>
                 <w:rStyle w:val="Hyperlink"/>
@@ -3309,7 +3345,7 @@
                 <w:noProof/>
                 <w:webHidden/>
               </w:rPr>
-              <w:instrText xml:space="preserve"> PAGEREF _Toc232646147 \h </w:instrText>
+              <w:instrText xml:space="preserve"> PAGEREF _Toc233315791 \h </w:instrText>
             </w:r>
             <w:r>
               <w:rPr>
@@ -3329,7 +3365,7 @@
                 <w:noProof/>
                 <w:webHidden/>
               </w:rPr>
-              <w:t>22</w:t>
+              <w:t>23</w:t>
             </w:r>
             <w:r>
               <w:rPr>
@@ -3356,7 +3392,7 @@
               <w14:ligatures w14:val="standardContextual"/>
             </w:rPr>
           </w:pPr>
-          <w:hyperlink w:anchor="_Toc232646148" w:history="1">
+          <w:hyperlink w:anchor="_Toc233315792" w:history="1">
             <w:r>
               <w:rPr>
                 <w:rStyle w:val="Hyperlink"/>
@@ -3387,7 +3423,7 @@
                 <w:noProof/>
                 <w:webHidden/>
               </w:rPr>
-              <w:instrText xml:space="preserve"> PAGEREF _Toc232646148 \h </w:instrText>
+              <w:instrText xml:space="preserve"> PAGEREF _Toc233315792 \h </w:instrText>
             </w:r>
             <w:r>
               <w:rPr>
@@ -3407,7 +3443,7 @@
                 <w:noProof/>
                 <w:webHidden/>
               </w:rPr>
-              <w:t>23</w:t>
+              <w:t>25</w:t>
             </w:r>
             <w:r>
               <w:rPr>
@@ -3434,7 +3470,7 @@
               <w14:ligatures w14:val="standardContextual"/>
             </w:rPr>
           </w:pPr>
-          <w:hyperlink w:anchor="_Toc232646149" w:history="1">
+          <w:hyperlink w:anchor="_Toc233315793" w:history="1">
             <w:r>
               <w:rPr>
                 <w:rStyle w:val="Hyperlink"/>
@@ -3463,7 +3499,7 @@
                 <w:noProof/>
                 <w:webHidden/>
               </w:rPr>
-              <w:instrText xml:space="preserve"> PAGEREF _Toc232646149 \h </w:instrText>
+              <w:instrText xml:space="preserve"> PAGEREF _Toc233315793 \h </w:instrText>
             </w:r>
             <w:r>
               <w:rPr>
@@ -3483,7 +3519,7 @@
                 <w:noProof/>
                 <w:webHidden/>
               </w:rPr>
-              <w:t>23</w:t>
+              <w:t>25</w:t>
             </w:r>
             <w:r>
               <w:rPr>
@@ -3510,7 +3546,7 @@
               <w14:ligatures w14:val="standardContextual"/>
             </w:rPr>
           </w:pPr>
-          <w:hyperlink w:anchor="_Toc232646150" w:history="1">
+          <w:hyperlink w:anchor="_Toc233315794" w:history="1">
             <w:r>
               <w:rPr>
                 <w:rStyle w:val="Hyperlink"/>
@@ -3539,7 +3575,7 @@
                 <w:noProof/>
                 <w:webHidden/>
               </w:rPr>
-              <w:instrText xml:space="preserve"> PAGEREF _Toc232646150 \h </w:instrText>
+              <w:instrText xml:space="preserve"> PAGEREF _Toc233315794 \h </w:instrText>
             </w:r>
             <w:r>
               <w:rPr>
@@ -3559,7 +3595,7 @@
                 <w:noProof/>
                 <w:webHidden/>
               </w:rPr>
-              <w:t>23</w:t>
+              <w:t>25</w:t>
             </w:r>
             <w:r>
               <w:rPr>
@@ -3586,7 +3622,7 @@
               <w14:ligatures w14:val="standardContextual"/>
             </w:rPr>
           </w:pPr>
-          <w:hyperlink w:anchor="_Toc232646151" w:history="1">
+          <w:hyperlink w:anchor="_Toc233315795" w:history="1">
             <w:r>
               <w:rPr>
                 <w:rStyle w:val="Hyperlink"/>
@@ -3615,7 +3651,7 @@
                 <w:noProof/>
                 <w:webHidden/>
               </w:rPr>
-              <w:instrText xml:space="preserve"> PAGEREF _Toc232646151 \h </w:instrText>
+              <w:instrText xml:space="preserve"> PAGEREF _Toc233315795 \h </w:instrText>
             </w:r>
             <w:r>
               <w:rPr>
@@ -3635,7 +3671,7 @@
                 <w:noProof/>
                 <w:webHidden/>
               </w:rPr>
-              <w:t>24</w:t>
+              <w:t>26</w:t>
             </w:r>
             <w:r>
               <w:rPr>
@@ -3662,7 +3698,7 @@
               <w14:ligatures w14:val="standardContextual"/>
             </w:rPr>
           </w:pPr>
-          <w:hyperlink w:anchor="_Toc232646152" w:history="1">
+          <w:hyperlink w:anchor="_Toc233315796" w:history="1">
             <w:r>
               <w:rPr>
                 <w:rStyle w:val="Hyperlink"/>
@@ -3691,7 +3727,7 @@
                 <w:noProof/>
                 <w:webHidden/>
               </w:rPr>
-              <w:instrText xml:space="preserve"> PAGEREF _Toc232646152 \h </w:instrText>
+              <w:instrText xml:space="preserve"> PAGEREF _Toc233315796 \h </w:instrText>
             </w:r>
             <w:r>
               <w:rPr>
@@ -3711,7 +3747,7 @@
                 <w:noProof/>
                 <w:webHidden/>
               </w:rPr>
-              <w:t>24</w:t>
+              <w:t>26</w:t>
             </w:r>
             <w:r>
               <w:rPr>
@@ -3738,7 +3774,7 @@
               <w14:ligatures w14:val="standardContextual"/>
             </w:rPr>
           </w:pPr>
-          <w:hyperlink w:anchor="_Toc232646153" w:history="1">
+          <w:hyperlink w:anchor="_Toc233315797" w:history="1">
             <w:r>
               <w:rPr>
                 <w:rStyle w:val="Hyperlink"/>
@@ -3767,7 +3803,7 @@
                 <w:noProof/>
                 <w:webHidden/>
               </w:rPr>
-              <w:instrText xml:space="preserve"> PAGEREF _Toc232646153 \h </w:instrText>
+              <w:instrText xml:space="preserve"> PAGEREF _Toc233315797 \h </w:instrText>
             </w:r>
             <w:r>
               <w:rPr>
@@ -3787,7 +3823,7 @@
                 <w:noProof/>
                 <w:webHidden/>
               </w:rPr>
-              <w:t>25</w:t>
+              <w:t>27</w:t>
             </w:r>
             <w:r>
               <w:rPr>
@@ -3814,7 +3850,7 @@
               <w14:ligatures w14:val="standardContextual"/>
             </w:rPr>
           </w:pPr>
-          <w:hyperlink w:anchor="_Toc232646154" w:history="1">
+          <w:hyperlink w:anchor="_Toc233315798" w:history="1">
             <w:r>
               <w:rPr>
                 <w:rStyle w:val="Hyperlink"/>
@@ -3843,7 +3879,7 @@
                 <w:noProof/>
                 <w:webHidden/>
               </w:rPr>
-              <w:instrText xml:space="preserve"> PAGEREF _Toc232646154 \h </w:instrText>
+              <w:instrText xml:space="preserve"> PAGEREF _Toc233315798 \h </w:instrText>
             </w:r>
             <w:r>
               <w:rPr>
@@ -3863,7 +3899,7 @@
                 <w:noProof/>
                 <w:webHidden/>
               </w:rPr>
-              <w:t>25</w:t>
+              <w:t>27</w:t>
             </w:r>
             <w:r>
               <w:rPr>
@@ -3890,7 +3926,7 @@
               <w14:ligatures w14:val="standardContextual"/>
             </w:rPr>
           </w:pPr>
-          <w:hyperlink w:anchor="_Toc232646155" w:history="1">
+          <w:hyperlink w:anchor="_Toc233315799" w:history="1">
             <w:r>
               <w:rPr>
                 <w:rStyle w:val="Hyperlink"/>
@@ -3919,7 +3955,7 @@
                 <w:noProof/>
                 <w:webHidden/>
               </w:rPr>
-              <w:instrText xml:space="preserve"> PAGEREF _Toc232646155 \h </w:instrText>
+              <w:instrText xml:space="preserve"> PAGEREF _Toc233315799 \h </w:instrText>
             </w:r>
             <w:r>
               <w:rPr>
@@ -3939,7 +3975,7 @@
                 <w:noProof/>
                 <w:webHidden/>
               </w:rPr>
-              <w:t>25</w:t>
+              <w:t>27</w:t>
             </w:r>
             <w:r>
               <w:rPr>
@@ -3966,7 +4002,7 @@
               <w14:ligatures w14:val="standardContextual"/>
             </w:rPr>
           </w:pPr>
-          <w:hyperlink w:anchor="_Toc232646156" w:history="1">
+          <w:hyperlink w:anchor="_Toc233315800" w:history="1">
             <w:r>
               <w:rPr>
                 <w:rStyle w:val="Hyperlink"/>
@@ -3995,7 +4031,7 @@
                 <w:noProof/>
                 <w:webHidden/>
               </w:rPr>
-              <w:instrText xml:space="preserve"> PAGEREF _Toc232646156 \h </w:instrText>
+              <w:instrText xml:space="preserve"> PAGEREF _Toc233315800 \h </w:instrText>
             </w:r>
             <w:r>
               <w:rPr>
@@ -4015,7 +4051,7 @@
                 <w:noProof/>
                 <w:webHidden/>
               </w:rPr>
-              <w:t>25</w:t>
+              <w:t>27</w:t>
             </w:r>
             <w:r>
               <w:rPr>
@@ -4042,7 +4078,7 @@
               <w14:ligatures w14:val="standardContextual"/>
             </w:rPr>
           </w:pPr>
-          <w:hyperlink w:anchor="_Toc232646157" w:history="1">
+          <w:hyperlink w:anchor="_Toc233315801" w:history="1">
             <w:r>
               <w:rPr>
                 <w:rStyle w:val="Hyperlink"/>
@@ -4072,7 +4108,7 @@
                 <w:noProof/>
                 <w:webHidden/>
               </w:rPr>
-              <w:instrText xml:space="preserve"> PAGEREF _Toc232646157 \h </w:instrText>
+              <w:instrText xml:space="preserve"> PAGEREF _Toc233315801 \h </w:instrText>
             </w:r>
             <w:r>
               <w:rPr>
@@ -4092,7 +4128,7 @@
                 <w:noProof/>
                 <w:webHidden/>
               </w:rPr>
-              <w:t>26</w:t>
+              <w:t>28</w:t>
             </w:r>
             <w:r>
               <w:rPr>
@@ -4119,7 +4155,7 @@
               <w14:ligatures w14:val="standardContextual"/>
             </w:rPr>
           </w:pPr>
-          <w:hyperlink w:anchor="_Toc232646158" w:history="1">
+          <w:hyperlink w:anchor="_Toc233315802" w:history="1">
             <w:r>
               <w:rPr>
                 <w:rStyle w:val="Hyperlink"/>
@@ -4147,7 +4183,7 @@
                 <w:noProof/>
                 <w:webHidden/>
               </w:rPr>
-              <w:instrText xml:space="preserve"> PAGEREF _Toc232646158 \h </w:instrText>
+              <w:instrText xml:space="preserve"> PAGEREF _Toc233315802 \h </w:instrText>
             </w:r>
             <w:r>
               <w:rPr>
@@ -4167,7 +4203,7 @@
                 <w:noProof/>
                 <w:webHidden/>
               </w:rPr>
-              <w:t>26</w:t>
+              <w:t>28</w:t>
             </w:r>
             <w:r>
               <w:rPr>
@@ -4194,7 +4230,7 @@
               <w14:ligatures w14:val="standardContextual"/>
             </w:rPr>
           </w:pPr>
-          <w:hyperlink w:anchor="_Toc232646159" w:history="1">
+          <w:hyperlink w:anchor="_Toc233315803" w:history="1">
             <w:r>
               <w:rPr>
                 <w:rStyle w:val="Hyperlink"/>
@@ -4222,7 +4258,7 @@
                 <w:noProof/>
                 <w:webHidden/>
               </w:rPr>
-              <w:instrText xml:space="preserve"> PAGEREF _Toc232646159 \h </w:instrText>
+              <w:instrText xml:space="preserve"> PAGEREF _Toc233315803 \h </w:instrText>
             </w:r>
             <w:r>
               <w:rPr>
@@ -4242,7 +4278,7 @@
                 <w:noProof/>
                 <w:webHidden/>
               </w:rPr>
-              <w:t>27</w:t>
+              <w:t>29</w:t>
             </w:r>
             <w:r>
               <w:rPr>
@@ -4269,7 +4305,7 @@
               <w14:ligatures w14:val="standardContextual"/>
             </w:rPr>
           </w:pPr>
-          <w:hyperlink w:anchor="_Toc232646160" w:history="1">
+          <w:hyperlink w:anchor="_Toc233315804" w:history="1">
             <w:r>
               <w:rPr>
                 <w:rStyle w:val="Hyperlink"/>
@@ -4297,7 +4333,7 @@
                 <w:noProof/>
                 <w:webHidden/>
               </w:rPr>
-              <w:instrText xml:space="preserve"> PAGEREF _Toc232646160 \h </w:instrText>
+              <w:instrText xml:space="preserve"> PAGEREF _Toc233315804 \h </w:instrText>
             </w:r>
             <w:r>
               <w:rPr>
@@ -4317,7 +4353,7 @@
                 <w:noProof/>
                 <w:webHidden/>
               </w:rPr>
-              <w:t>27</w:t>
+              <w:t>29</w:t>
             </w:r>
             <w:r>
               <w:rPr>
@@ -4344,7 +4380,7 @@
               <w14:ligatures w14:val="standardContextual"/>
             </w:rPr>
           </w:pPr>
-          <w:hyperlink w:anchor="_Toc232646161" w:history="1">
+          <w:hyperlink w:anchor="_Toc233315805" w:history="1">
             <w:r>
               <w:rPr>
                 <w:rStyle w:val="Hyperlink"/>
@@ -4372,7 +4408,7 @@
                 <w:noProof/>
                 <w:webHidden/>
               </w:rPr>
-              <w:instrText xml:space="preserve"> PAGEREF _Toc232646161 \h </w:instrText>
+              <w:instrText xml:space="preserve"> PAGEREF _Toc233315805 \h </w:instrText>
             </w:r>
             <w:r>
               <w:rPr>
@@ -4392,7 +4428,534 @@
                 <w:noProof/>
                 <w:webHidden/>
               </w:rPr>
-              <w:t>27</w:t>
+              <w:t>29</w:t>
+            </w:r>
+            <w:r>
+              <w:rPr>
+                <w:noProof/>
+                <w:webHidden/>
+              </w:rPr>
+              <w:fldChar w:fldCharType="end"/>
+            </w:r>
+          </w:hyperlink>
+        </w:p>
+        <w:p>
+          <w:pPr>
+            <w:pStyle w:val="TOC1"/>
+            <w:tabs>
+              <w:tab w:val="right" w:leader="dot" w:pos="9350"/>
+            </w:tabs>
+            <w:rPr>
+              <w:rFonts w:eastAsiaTheme="minorEastAsia"/>
+              <w:noProof/>
+              <w:kern w:val="2"/>
+              <w:sz w:val="24"/>
+              <w:szCs w:val="24"/>
+              <w:lang w:val="en-KE" w:eastAsia="en-KE"/>
+              <w14:ligatures w14:val="standardContextual"/>
+            </w:rPr>
+          </w:pPr>
+          <w:hyperlink w:anchor="_Toc233315806" w:history="1">
+            <w:r>
+              <w:rPr>
+                <w:rStyle w:val="Hyperlink"/>
+                <w:rFonts w:ascii="Times New Roman" w:hAnsi="Times New Roman" w:cs="Times New Roman"/>
+                <w:b/>
+                <w:bCs/>
+                <w:noProof/>
+              </w:rPr>
+              <w:t>WEEK 8</w:t>
+            </w:r>
+            <w:r>
+              <w:rPr>
+                <w:noProof/>
+                <w:webHidden/>
+              </w:rPr>
+              <w:tab/>
+            </w:r>
+            <w:r>
+              <w:rPr>
+                <w:noProof/>
+                <w:webHidden/>
+              </w:rPr>
+              <w:fldChar w:fldCharType="begin"/>
+            </w:r>
+            <w:r>
+              <w:rPr>
+                <w:noProof/>
+                <w:webHidden/>
+              </w:rPr>
+              <w:instrText xml:space="preserve"> PAGEREF _Toc233315806 \h </w:instrText>
+            </w:r>
+            <w:r>
+              <w:rPr>
+                <w:noProof/>
+                <w:webHidden/>
+              </w:rPr>
+            </w:r>
+            <w:r>
+              <w:rPr>
+                <w:noProof/>
+                <w:webHidden/>
+              </w:rPr>
+              <w:fldChar w:fldCharType="separate"/>
+            </w:r>
+            <w:r>
+              <w:rPr>
+                <w:noProof/>
+                <w:webHidden/>
+              </w:rPr>
+              <w:t>30</w:t>
+            </w:r>
+            <w:r>
+              <w:rPr>
+                <w:noProof/>
+                <w:webHidden/>
+              </w:rPr>
+              <w:fldChar w:fldCharType="end"/>
+            </w:r>
+          </w:hyperlink>
+        </w:p>
+        <w:p>
+          <w:pPr>
+            <w:pStyle w:val="TOC2"/>
+            <w:tabs>
+              <w:tab w:val="right" w:leader="dot" w:pos="9350"/>
+            </w:tabs>
+            <w:rPr>
+              <w:rFonts w:eastAsiaTheme="minorEastAsia"/>
+              <w:noProof/>
+              <w:kern w:val="2"/>
+              <w:sz w:val="24"/>
+              <w:szCs w:val="24"/>
+              <w:lang w:val="en-KE" w:eastAsia="en-KE"/>
+              <w14:ligatures w14:val="standardContextual"/>
+            </w:rPr>
+          </w:pPr>
+          <w:hyperlink w:anchor="_Toc233315807" w:history="1">
+            <w:r>
+              <w:rPr>
+                <w:rStyle w:val="Hyperlink"/>
+                <w:rFonts w:ascii="Times New Roman" w:hAnsi="Times New Roman" w:cs="Times New Roman"/>
+                <w:noProof/>
+              </w:rPr>
+              <w:t>Fig 1- Installation Output</w:t>
+            </w:r>
+            <w:r>
+              <w:rPr>
+                <w:noProof/>
+                <w:webHidden/>
+              </w:rPr>
+              <w:tab/>
+            </w:r>
+            <w:r>
+              <w:rPr>
+                <w:noProof/>
+                <w:webHidden/>
+              </w:rPr>
+              <w:fldChar w:fldCharType="begin"/>
+            </w:r>
+            <w:r>
+              <w:rPr>
+                <w:noProof/>
+                <w:webHidden/>
+              </w:rPr>
+              <w:instrText xml:space="preserve"> PAGEREF _Toc233315807 \h </w:instrText>
+            </w:r>
+            <w:r>
+              <w:rPr>
+                <w:noProof/>
+                <w:webHidden/>
+              </w:rPr>
+            </w:r>
+            <w:r>
+              <w:rPr>
+                <w:noProof/>
+                <w:webHidden/>
+              </w:rPr>
+              <w:fldChar w:fldCharType="separate"/>
+            </w:r>
+            <w:r>
+              <w:rPr>
+                <w:noProof/>
+                <w:webHidden/>
+              </w:rPr>
+              <w:t>30</w:t>
+            </w:r>
+            <w:r>
+              <w:rPr>
+                <w:noProof/>
+                <w:webHidden/>
+              </w:rPr>
+              <w:fldChar w:fldCharType="end"/>
+            </w:r>
+          </w:hyperlink>
+        </w:p>
+        <w:p>
+          <w:pPr>
+            <w:pStyle w:val="TOC2"/>
+            <w:tabs>
+              <w:tab w:val="right" w:leader="dot" w:pos="9350"/>
+            </w:tabs>
+            <w:rPr>
+              <w:rFonts w:eastAsiaTheme="minorEastAsia"/>
+              <w:noProof/>
+              <w:kern w:val="2"/>
+              <w:sz w:val="24"/>
+              <w:szCs w:val="24"/>
+              <w:lang w:val="en-KE" w:eastAsia="en-KE"/>
+              <w14:ligatures w14:val="standardContextual"/>
+            </w:rPr>
+          </w:pPr>
+          <w:hyperlink w:anchor="_Toc233315808" w:history="1">
+            <w:r>
+              <w:rPr>
+                <w:rStyle w:val="Hyperlink"/>
+                <w:rFonts w:ascii="Times New Roman" w:hAnsi="Times New Roman" w:cs="Times New Roman"/>
+                <w:noProof/>
+              </w:rPr>
+              <w:t>Fig 2- Sentiment Analysis Output</w:t>
+            </w:r>
+            <w:r>
+              <w:rPr>
+                <w:noProof/>
+                <w:webHidden/>
+              </w:rPr>
+              <w:tab/>
+            </w:r>
+            <w:r>
+              <w:rPr>
+                <w:noProof/>
+                <w:webHidden/>
+              </w:rPr>
+              <w:fldChar w:fldCharType="begin"/>
+            </w:r>
+            <w:r>
+              <w:rPr>
+                <w:noProof/>
+                <w:webHidden/>
+              </w:rPr>
+              <w:instrText xml:space="preserve"> PAGEREF _Toc233315808 \h </w:instrText>
+            </w:r>
+            <w:r>
+              <w:rPr>
+                <w:noProof/>
+                <w:webHidden/>
+              </w:rPr>
+            </w:r>
+            <w:r>
+              <w:rPr>
+                <w:noProof/>
+                <w:webHidden/>
+              </w:rPr>
+              <w:fldChar w:fldCharType="separate"/>
+            </w:r>
+            <w:r>
+              <w:rPr>
+                <w:noProof/>
+                <w:webHidden/>
+              </w:rPr>
+              <w:t>32</w:t>
+            </w:r>
+            <w:r>
+              <w:rPr>
+                <w:noProof/>
+                <w:webHidden/>
+              </w:rPr>
+              <w:fldChar w:fldCharType="end"/>
+            </w:r>
+          </w:hyperlink>
+        </w:p>
+        <w:p>
+          <w:pPr>
+            <w:pStyle w:val="TOC2"/>
+            <w:tabs>
+              <w:tab w:val="right" w:leader="dot" w:pos="9350"/>
+            </w:tabs>
+            <w:rPr>
+              <w:rFonts w:eastAsiaTheme="minorEastAsia"/>
+              <w:noProof/>
+              <w:kern w:val="2"/>
+              <w:sz w:val="24"/>
+              <w:szCs w:val="24"/>
+              <w:lang w:val="en-KE" w:eastAsia="en-KE"/>
+              <w14:ligatures w14:val="standardContextual"/>
+            </w:rPr>
+          </w:pPr>
+          <w:hyperlink w:anchor="_Toc233315809" w:history="1">
+            <w:r>
+              <w:rPr>
+                <w:rStyle w:val="Hyperlink"/>
+                <w:rFonts w:ascii="Times New Roman" w:hAnsi="Times New Roman" w:cs="Times New Roman"/>
+                <w:noProof/>
+              </w:rPr>
+              <w:t>Fig 3- Sentiment Confidence Chart</w:t>
+            </w:r>
+            <w:r>
+              <w:rPr>
+                <w:noProof/>
+                <w:webHidden/>
+              </w:rPr>
+              <w:tab/>
+            </w:r>
+            <w:r>
+              <w:rPr>
+                <w:noProof/>
+                <w:webHidden/>
+              </w:rPr>
+              <w:fldChar w:fldCharType="begin"/>
+            </w:r>
+            <w:r>
+              <w:rPr>
+                <w:noProof/>
+                <w:webHidden/>
+              </w:rPr>
+              <w:instrText xml:space="preserve"> PAGEREF _Toc233315809 \h </w:instrText>
+            </w:r>
+            <w:r>
+              <w:rPr>
+                <w:noProof/>
+                <w:webHidden/>
+              </w:rPr>
+            </w:r>
+            <w:r>
+              <w:rPr>
+                <w:noProof/>
+                <w:webHidden/>
+              </w:rPr>
+              <w:fldChar w:fldCharType="separate"/>
+            </w:r>
+            <w:r>
+              <w:rPr>
+                <w:noProof/>
+                <w:webHidden/>
+              </w:rPr>
+              <w:t>32</w:t>
+            </w:r>
+            <w:r>
+              <w:rPr>
+                <w:noProof/>
+                <w:webHidden/>
+              </w:rPr>
+              <w:fldChar w:fldCharType="end"/>
+            </w:r>
+          </w:hyperlink>
+        </w:p>
+        <w:p>
+          <w:pPr>
+            <w:pStyle w:val="TOC2"/>
+            <w:tabs>
+              <w:tab w:val="right" w:leader="dot" w:pos="9350"/>
+            </w:tabs>
+            <w:rPr>
+              <w:rFonts w:eastAsiaTheme="minorEastAsia"/>
+              <w:noProof/>
+              <w:kern w:val="2"/>
+              <w:sz w:val="24"/>
+              <w:szCs w:val="24"/>
+              <w:lang w:val="en-KE" w:eastAsia="en-KE"/>
+              <w14:ligatures w14:val="standardContextual"/>
+            </w:rPr>
+          </w:pPr>
+          <w:hyperlink w:anchor="_Toc233315810" w:history="1">
+            <w:r>
+              <w:rPr>
+                <w:rStyle w:val="Hyperlink"/>
+                <w:rFonts w:ascii="Times New Roman" w:hAnsi="Times New Roman" w:cs="Times New Roman"/>
+                <w:noProof/>
+              </w:rPr>
+              <w:t>Fig 4- GPT-2 Text Generation Output</w:t>
+            </w:r>
+            <w:r>
+              <w:rPr>
+                <w:noProof/>
+                <w:webHidden/>
+              </w:rPr>
+              <w:tab/>
+            </w:r>
+            <w:r>
+              <w:rPr>
+                <w:noProof/>
+                <w:webHidden/>
+              </w:rPr>
+              <w:fldChar w:fldCharType="begin"/>
+            </w:r>
+            <w:r>
+              <w:rPr>
+                <w:noProof/>
+                <w:webHidden/>
+              </w:rPr>
+              <w:instrText xml:space="preserve"> PAGEREF _Toc233315810 \h </w:instrText>
+            </w:r>
+            <w:r>
+              <w:rPr>
+                <w:noProof/>
+                <w:webHidden/>
+              </w:rPr>
+            </w:r>
+            <w:r>
+              <w:rPr>
+                <w:noProof/>
+                <w:webHidden/>
+              </w:rPr>
+              <w:fldChar w:fldCharType="separate"/>
+            </w:r>
+            <w:r>
+              <w:rPr>
+                <w:noProof/>
+                <w:webHidden/>
+              </w:rPr>
+              <w:t>33</w:t>
+            </w:r>
+            <w:r>
+              <w:rPr>
+                <w:noProof/>
+                <w:webHidden/>
+              </w:rPr>
+              <w:fldChar w:fldCharType="end"/>
+            </w:r>
+          </w:hyperlink>
+        </w:p>
+        <w:p>
+          <w:pPr>
+            <w:pStyle w:val="TOC2"/>
+            <w:tabs>
+              <w:tab w:val="right" w:leader="dot" w:pos="9350"/>
+            </w:tabs>
+            <w:rPr>
+              <w:rFonts w:eastAsiaTheme="minorEastAsia"/>
+              <w:noProof/>
+              <w:kern w:val="2"/>
+              <w:sz w:val="24"/>
+              <w:szCs w:val="24"/>
+              <w:lang w:val="en-KE" w:eastAsia="en-KE"/>
+              <w14:ligatures w14:val="standardContextual"/>
+            </w:rPr>
+          </w:pPr>
+          <w:hyperlink w:anchor="_Toc233315811" w:history="1">
+            <w:r>
+              <w:rPr>
+                <w:rStyle w:val="Hyperlink"/>
+                <w:rFonts w:ascii="Times New Roman" w:hAnsi="Times New Roman" w:cs="Times New Roman"/>
+                <w:noProof/>
+              </w:rPr>
+              <w:t>Fig 5- Text Generation with Different Lengths</w:t>
+            </w:r>
+            <w:r>
+              <w:rPr>
+                <w:noProof/>
+                <w:webHidden/>
+              </w:rPr>
+              <w:tab/>
+            </w:r>
+            <w:r>
+              <w:rPr>
+                <w:noProof/>
+                <w:webHidden/>
+              </w:rPr>
+              <w:fldChar w:fldCharType="begin"/>
+            </w:r>
+            <w:r>
+              <w:rPr>
+                <w:noProof/>
+                <w:webHidden/>
+              </w:rPr>
+              <w:instrText xml:space="preserve"> PAGEREF _Toc233315811 \h </w:instrText>
+            </w:r>
+            <w:r>
+              <w:rPr>
+                <w:noProof/>
+                <w:webHidden/>
+              </w:rPr>
+            </w:r>
+            <w:r>
+              <w:rPr>
+                <w:noProof/>
+                <w:webHidden/>
+              </w:rPr>
+              <w:fldChar w:fldCharType="separate"/>
+            </w:r>
+            <w:r>
+              <w:rPr>
+                <w:noProof/>
+                <w:webHidden/>
+              </w:rPr>
+              <w:t>33</w:t>
+            </w:r>
+            <w:r>
+              <w:rPr>
+                <w:noProof/>
+                <w:webHidden/>
+              </w:rPr>
+              <w:fldChar w:fldCharType="end"/>
+            </w:r>
+          </w:hyperlink>
+        </w:p>
+        <w:p>
+          <w:pPr>
+            <w:pStyle w:val="TOC2"/>
+            <w:tabs>
+              <w:tab w:val="right" w:leader="dot" w:pos="9350"/>
+            </w:tabs>
+            <w:rPr>
+              <w:rFonts w:eastAsiaTheme="minorEastAsia"/>
+              <w:noProof/>
+              <w:kern w:val="2"/>
+              <w:sz w:val="24"/>
+              <w:szCs w:val="24"/>
+              <w:lang w:val="en-KE" w:eastAsia="en-KE"/>
+              <w14:ligatures w14:val="standardContextual"/>
+            </w:rPr>
+          </w:pPr>
+          <w:hyperlink w:anchor="_Toc233315812" w:history="1">
+            <w:r>
+              <w:rPr>
+                <w:rStyle w:val="Hyperlink"/>
+                <w:rFonts w:ascii="Times New Roman" w:hAnsi="Times New Roman" w:cs="Times New Roman"/>
+                <w:noProof/>
+              </w:rPr>
+              <w:t>WEEK 8 REFLECTION</w:t>
+            </w:r>
+            <w:r>
+              <w:rPr>
+                <w:noProof/>
+                <w:webHidden/>
+              </w:rPr>
+              <w:tab/>
+            </w:r>
+            <w:r>
+              <w:rPr>
+                <w:noProof/>
+                <w:webHidden/>
+              </w:rPr>
+              <w:fldChar w:fldCharType="begin"/>
+            </w:r>
+            <w:r>
+              <w:rPr>
+                <w:noProof/>
+                <w:webHidden/>
+              </w:rPr>
+              <w:instrText xml:space="preserve"> PAGEREF _Toc233315812 \h </w:instrText>
+            </w:r>
+            <w:r>
+              <w:rPr>
+                <w:noProof/>
+                <w:webHidden/>
+              </w:rPr>
+            </w:r>
+            <w:r>
+              <w:rPr>
+                <w:noProof/>
+                <w:webHidden/>
+              </w:rPr>
+              <w:fldChar w:fldCharType="separate"/>
+            </w:r>
+            <w:r>
+              <w:rPr>
+                <w:noProof/>
+                <w:webHidden/>
+              </w:rPr>
+              <w:t>33</w:t>
             </w:r>
             <w:r>
               <w:rPr>
@@ -4453,70 +5016,24 @@
     </w:p>
     <w:p>
       <w:pPr>
-        <w:rPr>
-          <w:rFonts w:ascii="Times New Roman" w:hAnsi="Times New Roman" w:cs="Times New Roman"/>
+        <w:pStyle w:val="Heading1"/>
+        <w:rPr>
+          <w:rFonts w:ascii="Times New Roman" w:hAnsi="Times New Roman" w:cs="Times New Roman"/>
+          <w:b/>
+          <w:color w:val="auto"/>
           <w:sz w:val="28"/>
           <w:szCs w:val="28"/>
         </w:rPr>
       </w:pPr>
-    </w:p>
-    <w:p>
-      <w:pPr>
-        <w:rPr>
-          <w:rFonts w:ascii="Times New Roman" w:hAnsi="Times New Roman" w:cs="Times New Roman"/>
+      <w:bookmarkStart w:id="0" w:name="_Toc233315754"/>
+      <w:r>
+        <w:rPr>
+          <w:rFonts w:ascii="Times New Roman" w:hAnsi="Times New Roman" w:cs="Times New Roman"/>
+          <w:b/>
+          <w:color w:val="auto"/>
           <w:sz w:val="28"/>
           <w:szCs w:val="28"/>
         </w:rPr>
-      </w:pPr>
-    </w:p>
-    <w:p>
-      <w:pPr>
-        <w:rPr>
-          <w:rFonts w:ascii="Times New Roman" w:hAnsi="Times New Roman" w:cs="Times New Roman"/>
-          <w:sz w:val="28"/>
-          <w:szCs w:val="28"/>
-        </w:rPr>
-      </w:pPr>
-    </w:p>
-    <w:p>
-      <w:pPr>
-        <w:rPr>
-          <w:rFonts w:ascii="Times New Roman" w:hAnsi="Times New Roman" w:cs="Times New Roman"/>
-          <w:sz w:val="28"/>
-          <w:szCs w:val="28"/>
-        </w:rPr>
-      </w:pPr>
-    </w:p>
-    <w:p>
-      <w:pPr>
-        <w:rPr>
-          <w:rFonts w:ascii="Times New Roman" w:hAnsi="Times New Roman" w:cs="Times New Roman"/>
-          <w:sz w:val="28"/>
-          <w:szCs w:val="28"/>
-        </w:rPr>
-      </w:pPr>
-    </w:p>
-    <w:p>
-      <w:pPr>
-        <w:pStyle w:val="Heading1"/>
-        <w:rPr>
-          <w:rFonts w:ascii="Times New Roman" w:hAnsi="Times New Roman" w:cs="Times New Roman"/>
-          <w:b/>
-          <w:color w:val="auto"/>
-          <w:sz w:val="28"/>
-          <w:szCs w:val="28"/>
-        </w:rPr>
-      </w:pPr>
-      <w:bookmarkStart w:id="0" w:name="_Toc232646110"/>
-      <w:r>
-        <w:rPr>
-          <w:rFonts w:ascii="Times New Roman" w:hAnsi="Times New Roman" w:cs="Times New Roman"/>
-          <w:b/>
-          <w:color w:val="auto"/>
-          <w:sz w:val="28"/>
-          <w:szCs w:val="28"/>
-        </w:rPr>
-        <w:lastRenderedPageBreak/>
         <w:t>WEEK 1</w:t>
       </w:r>
       <w:bookmarkEnd w:id="0"/>
@@ -4574,7 +5091,7 @@
           <w:szCs w:val="24"/>
         </w:rPr>
       </w:pPr>
-      <w:bookmarkStart w:id="1" w:name="_Toc232646111"/>
+      <w:bookmarkStart w:id="1" w:name="_Toc233315755"/>
       <w:r>
         <w:rPr>
           <w:rFonts w:ascii="Times New Roman" w:hAnsi="Times New Roman" w:cs="Times New Roman"/>
@@ -4638,7 +5155,7 @@
           <w:szCs w:val="24"/>
         </w:rPr>
       </w:pPr>
-      <w:bookmarkStart w:id="2" w:name="_Toc232646112"/>
+      <w:bookmarkStart w:id="2" w:name="_Toc233315756"/>
       <w:r>
         <w:rPr>
           <w:rFonts w:ascii="Times New Roman" w:hAnsi="Times New Roman" w:cs="Times New Roman"/>
@@ -4734,7 +5251,7 @@
           <w:szCs w:val="24"/>
         </w:rPr>
       </w:pPr>
-      <w:bookmarkStart w:id="3" w:name="_Toc232646113"/>
+      <w:bookmarkStart w:id="3" w:name="_Toc233315757"/>
       <w:r>
         <w:rPr>
           <w:rFonts w:ascii="Times New Roman" w:hAnsi="Times New Roman" w:cs="Times New Roman"/>
@@ -4817,7 +5334,7 @@
           <w:szCs w:val="24"/>
         </w:rPr>
       </w:pPr>
-      <w:bookmarkStart w:id="4" w:name="_Toc232646114"/>
+      <w:bookmarkStart w:id="4" w:name="_Toc233315758"/>
       <w:r>
         <w:rPr>
           <w:rFonts w:ascii="Times New Roman" w:hAnsi="Times New Roman" w:cs="Times New Roman"/>
@@ -4901,7 +5418,7 @@
           <w:szCs w:val="24"/>
         </w:rPr>
       </w:pPr>
-      <w:bookmarkStart w:id="5" w:name="_Toc232646115"/>
+      <w:bookmarkStart w:id="5" w:name="_Toc233315759"/>
       <w:r>
         <w:rPr>
           <w:rFonts w:ascii="Times New Roman" w:hAnsi="Times New Roman" w:cs="Times New Roman"/>
@@ -4953,7 +5470,7 @@
           <w:szCs w:val="24"/>
         </w:rPr>
       </w:pPr>
-      <w:bookmarkStart w:id="6" w:name="_Toc232646116"/>
+      <w:bookmarkStart w:id="6" w:name="_Toc233315760"/>
       <w:r>
         <w:rPr>
           <w:rFonts w:ascii="Times New Roman" w:hAnsi="Times New Roman" w:cs="Times New Roman"/>
@@ -5110,7 +5627,7 @@
           <w:szCs w:val="28"/>
         </w:rPr>
       </w:pPr>
-      <w:bookmarkStart w:id="7" w:name="_Toc232646117"/>
+      <w:bookmarkStart w:id="7" w:name="_Toc233315761"/>
       <w:r>
         <w:rPr>
           <w:rFonts w:ascii="Times New Roman" w:hAnsi="Times New Roman" w:cs="Times New Roman"/>
@@ -5186,7 +5703,7 @@
           <w:szCs w:val="24"/>
         </w:rPr>
       </w:pPr>
-      <w:bookmarkStart w:id="8" w:name="_Toc232646118"/>
+      <w:bookmarkStart w:id="8" w:name="_Toc233315762"/>
       <w:r>
         <w:rPr>
           <w:rFonts w:ascii="Times New Roman" w:hAnsi="Times New Roman" w:cs="Times New Roman"/>
@@ -5270,7 +5787,7 @@
           <w:szCs w:val="24"/>
         </w:rPr>
       </w:pPr>
-      <w:bookmarkStart w:id="9" w:name="_Toc232646119"/>
+      <w:bookmarkStart w:id="9" w:name="_Toc233315763"/>
       <w:r>
         <w:rPr>
           <w:rFonts w:ascii="Times New Roman" w:hAnsi="Times New Roman" w:cs="Times New Roman"/>
@@ -5354,7 +5871,7 @@
           <w:szCs w:val="24"/>
         </w:rPr>
       </w:pPr>
-      <w:bookmarkStart w:id="10" w:name="_Toc232646120"/>
+      <w:bookmarkStart w:id="10" w:name="_Toc233315764"/>
       <w:r>
         <w:rPr>
           <w:rFonts w:ascii="Times New Roman" w:hAnsi="Times New Roman" w:cs="Times New Roman"/>
@@ -5386,7 +5903,7 @@
           <w:szCs w:val="24"/>
         </w:rPr>
       </w:pPr>
-      <w:bookmarkStart w:id="11" w:name="_Toc232646121"/>
+      <w:bookmarkStart w:id="11" w:name="_Toc233315765"/>
       <w:r>
         <w:rPr>
           <w:rFonts w:ascii="Times New Roman" w:hAnsi="Times New Roman" w:cs="Times New Roman"/>
@@ -5499,7 +6016,7 @@
           <w:szCs w:val="28"/>
         </w:rPr>
       </w:pPr>
-      <w:bookmarkStart w:id="12" w:name="_Toc232646122"/>
+      <w:bookmarkStart w:id="12" w:name="_Toc233315766"/>
       <w:r>
         <w:rPr>
           <w:rFonts w:ascii="Times New Roman" w:hAnsi="Times New Roman" w:cs="Times New Roman"/>
@@ -5575,7 +6092,7 @@
           <w:szCs w:val="24"/>
         </w:rPr>
       </w:pPr>
-      <w:bookmarkStart w:id="13" w:name="_Toc232646123"/>
+      <w:bookmarkStart w:id="13" w:name="_Toc233315767"/>
       <w:r>
         <w:rPr>
           <w:rFonts w:ascii="Times New Roman" w:hAnsi="Times New Roman" w:cs="Times New Roman"/>
@@ -5719,7 +6236,7 @@
           <w:szCs w:val="24"/>
         </w:rPr>
       </w:pPr>
-      <w:bookmarkStart w:id="14" w:name="_Toc232646124"/>
+      <w:bookmarkStart w:id="14" w:name="_Toc233315768"/>
       <w:r>
         <w:rPr>
           <w:rFonts w:ascii="Times New Roman" w:hAnsi="Times New Roman" w:cs="Times New Roman"/>
@@ -5805,7 +6322,7 @@
           <w:szCs w:val="24"/>
         </w:rPr>
       </w:pPr>
-      <w:bookmarkStart w:id="15" w:name="_Toc232646125"/>
+      <w:bookmarkStart w:id="15" w:name="_Toc233315769"/>
       <w:r>
         <w:rPr>
           <w:rFonts w:ascii="Times New Roman" w:hAnsi="Times New Roman" w:cs="Times New Roman"/>
@@ -5867,7 +6384,7 @@
           <w:szCs w:val="24"/>
         </w:rPr>
       </w:pPr>
-      <w:bookmarkStart w:id="16" w:name="_Toc232646126"/>
+      <w:bookmarkStart w:id="16" w:name="_Toc233315770"/>
       <w:r>
         <w:rPr>
           <w:rFonts w:ascii="Times New Roman" w:hAnsi="Times New Roman" w:cs="Times New Roman"/>
@@ -6043,7 +6560,7 @@
           <w:szCs w:val="28"/>
         </w:rPr>
       </w:pPr>
-      <w:bookmarkStart w:id="17" w:name="_Toc232646127"/>
+      <w:bookmarkStart w:id="17" w:name="_Toc233315771"/>
       <w:r>
         <w:rPr>
           <w:rFonts w:ascii="Times New Roman" w:hAnsi="Times New Roman" w:cs="Times New Roman"/>
@@ -6119,7 +6636,7 @@
           <w:szCs w:val="24"/>
         </w:rPr>
       </w:pPr>
-      <w:bookmarkStart w:id="18" w:name="_Toc232646128"/>
+      <w:bookmarkStart w:id="18" w:name="_Toc233315772"/>
       <w:r>
         <w:rPr>
           <w:rFonts w:ascii="Times New Roman" w:hAnsi="Times New Roman" w:cs="Times New Roman"/>
@@ -6202,7 +6719,7 @@
           <w:szCs w:val="24"/>
         </w:rPr>
       </w:pPr>
-      <w:bookmarkStart w:id="19" w:name="_Toc232646129"/>
+      <w:bookmarkStart w:id="19" w:name="_Toc233315773"/>
       <w:r>
         <w:rPr>
           <w:rFonts w:ascii="Times New Roman" w:hAnsi="Times New Roman" w:cs="Times New Roman"/>
@@ -6286,7 +6803,7 @@
           <w:szCs w:val="24"/>
         </w:rPr>
       </w:pPr>
-      <w:bookmarkStart w:id="20" w:name="_Toc232646130"/>
+      <w:bookmarkStart w:id="20" w:name="_Toc233315774"/>
       <w:r>
         <w:rPr>
           <w:rFonts w:ascii="Times New Roman" w:hAnsi="Times New Roman" w:cs="Times New Roman"/>
@@ -6360,7 +6877,7 @@
           <w:szCs w:val="24"/>
         </w:rPr>
       </w:pPr>
-      <w:bookmarkStart w:id="21" w:name="_Toc232646131"/>
+      <w:bookmarkStart w:id="21" w:name="_Toc233315775"/>
       <w:r>
         <w:rPr>
           <w:rFonts w:ascii="Times New Roman" w:hAnsi="Times New Roman" w:cs="Times New Roman"/>
@@ -6496,7 +7013,7 @@
           <w:szCs w:val="24"/>
         </w:rPr>
       </w:pPr>
-      <w:bookmarkStart w:id="22" w:name="_Toc232646132"/>
+      <w:bookmarkStart w:id="22" w:name="_Toc233315776"/>
       <w:r>
         <w:rPr>
           <w:rFonts w:ascii="Times New Roman" w:hAnsi="Times New Roman" w:cs="Times New Roman"/>
@@ -6527,7 +7044,7 @@
           <w:szCs w:val="24"/>
         </w:rPr>
       </w:pPr>
-      <w:bookmarkStart w:id="23" w:name="_Toc232646133"/>
+      <w:bookmarkStart w:id="23" w:name="_Toc233315777"/>
       <w:r>
         <w:rPr>
           <w:rFonts w:ascii="Times New Roman" w:hAnsi="Times New Roman" w:cs="Times New Roman"/>
@@ -6813,7 +7330,7 @@
           <w:szCs w:val="28"/>
         </w:rPr>
       </w:pPr>
-      <w:bookmarkStart w:id="24" w:name="_Toc232646134"/>
+      <w:bookmarkStart w:id="24" w:name="_Toc233315778"/>
       <w:r>
         <w:rPr>
           <w:rFonts w:ascii="Times New Roman" w:hAnsi="Times New Roman" w:cs="Times New Roman"/>
@@ -7091,7 +7608,7 @@
           <w:szCs w:val="24"/>
         </w:rPr>
       </w:pPr>
-      <w:bookmarkStart w:id="25" w:name="_Toc232646135"/>
+      <w:bookmarkStart w:id="25" w:name="_Toc233315779"/>
       <w:r>
         <w:rPr>
           <w:rFonts w:ascii="Times New Roman" w:hAnsi="Times New Roman" w:cs="Times New Roman"/>
@@ -7174,7 +7691,7 @@
           <w:szCs w:val="24"/>
         </w:rPr>
       </w:pPr>
-      <w:bookmarkStart w:id="26" w:name="_Toc232646136"/>
+      <w:bookmarkStart w:id="26" w:name="_Toc233315780"/>
       <w:r>
         <w:rPr>
           <w:rFonts w:ascii="Times New Roman" w:hAnsi="Times New Roman" w:cs="Times New Roman"/>
@@ -7258,7 +7775,7 @@
           <w:szCs w:val="24"/>
         </w:rPr>
       </w:pPr>
-      <w:bookmarkStart w:id="27" w:name="_Toc232646137"/>
+      <w:bookmarkStart w:id="27" w:name="_Toc233315781"/>
       <w:r>
         <w:rPr>
           <w:rFonts w:ascii="Times New Roman" w:hAnsi="Times New Roman" w:cs="Times New Roman"/>
@@ -7291,7 +7808,7 @@
           <w:szCs w:val="24"/>
         </w:rPr>
       </w:pPr>
-      <w:bookmarkStart w:id="28" w:name="_Toc232646138"/>
+      <w:bookmarkStart w:id="28" w:name="_Toc233315782"/>
       <w:r>
         <w:rPr>
           <w:rFonts w:ascii="Times New Roman" w:hAnsi="Times New Roman" w:cs="Times New Roman"/>
@@ -7413,7 +7930,7 @@
           <w:szCs w:val="28"/>
         </w:rPr>
       </w:pPr>
-      <w:bookmarkStart w:id="29" w:name="_Toc232646139"/>
+      <w:bookmarkStart w:id="29" w:name="_Toc233315783"/>
       <w:r>
         <w:rPr>
           <w:rFonts w:ascii="Times New Roman" w:hAnsi="Times New Roman" w:cs="Times New Roman"/>
@@ -7440,6 +7957,7 @@
       <w:r>
         <w:rPr>
           <w:rFonts w:ascii="Times New Roman" w:hAnsi="Times New Roman" w:cs="Times New Roman"/>
+          <w:noProof/>
           <w:sz w:val="24"/>
           <w:szCs w:val="24"/>
           <w:lang w:val="en-KE"/>
@@ -7515,26 +8033,16 @@
           <w:lang w:val="en-KE"/>
         </w:rPr>
       </w:pPr>
-      <w:bookmarkStart w:id="30" w:name="_Toc232646140"/>
-      <w:r>
-        <w:rPr>
-          <w:rFonts w:ascii="Times New Roman" w:hAnsi="Times New Roman" w:cs="Times New Roman"/>
-          <w:color w:val="auto"/>
-          <w:sz w:val="24"/>
-          <w:szCs w:val="24"/>
-          <w:lang w:val="en-KE"/>
-        </w:rPr>
-        <w:t>Fig 1</w:t>
-      </w:r>
-      <w:r>
-        <w:rPr>
-          <w:rFonts w:ascii="Times New Roman" w:hAnsi="Times New Roman" w:cs="Times New Roman"/>
-          <w:color w:val="auto"/>
-          <w:sz w:val="24"/>
-          <w:szCs w:val="24"/>
-          <w:lang w:val="en-KE"/>
-        </w:rPr>
-        <w:t xml:space="preserve">- </w:t>
+      <w:bookmarkStart w:id="30" w:name="_Toc233315784"/>
+      <w:r>
+        <w:rPr>
+          <w:rFonts w:ascii="Times New Roman" w:hAnsi="Times New Roman" w:cs="Times New Roman"/>
+          <w:color w:val="auto"/>
+          <w:sz w:val="24"/>
+          <w:szCs w:val="24"/>
+          <w:lang w:val="en-KE"/>
+        </w:rPr>
+        <w:t xml:space="preserve">Fig 1- </w:t>
       </w:r>
       <w:proofErr w:type="spellStart"/>
       <w:r>
@@ -7572,6 +8080,7 @@
       <w:r>
         <w:rPr>
           <w:rFonts w:ascii="Times New Roman" w:hAnsi="Times New Roman" w:cs="Times New Roman"/>
+          <w:noProof/>
           <w:sz w:val="24"/>
           <w:szCs w:val="24"/>
           <w:lang w:val="en-KE"/>
@@ -7637,36 +8146,16 @@
           <w:lang w:val="en-KE"/>
         </w:rPr>
       </w:pPr>
-      <w:bookmarkStart w:id="31" w:name="_Toc232646141"/>
-      <w:r>
-        <w:rPr>
-          <w:rFonts w:ascii="Times New Roman" w:hAnsi="Times New Roman" w:cs="Times New Roman"/>
-          <w:color w:val="auto"/>
-          <w:sz w:val="24"/>
-          <w:szCs w:val="24"/>
-          <w:lang w:val="en-KE"/>
-        </w:rPr>
-        <w:t>Fig 2</w:t>
-      </w:r>
-      <w:r>
-        <w:rPr>
-          <w:rFonts w:ascii="Times New Roman" w:hAnsi="Times New Roman" w:cs="Times New Roman"/>
-          <w:color w:val="auto"/>
-          <w:sz w:val="24"/>
-          <w:szCs w:val="24"/>
-          <w:lang w:val="en-KE"/>
-        </w:rPr>
-        <w:t>-</w:t>
-      </w:r>
-      <w:r>
-        <w:rPr>
-          <w:rFonts w:ascii="Times New Roman" w:hAnsi="Times New Roman" w:cs="Times New Roman"/>
-          <w:color w:val="auto"/>
-          <w:sz w:val="24"/>
-          <w:szCs w:val="24"/>
-          <w:lang w:val="en-KE"/>
-        </w:rPr>
-        <w:t xml:space="preserve"> One-Hot Encoding Output</w:t>
+      <w:bookmarkStart w:id="31" w:name="_Toc233315785"/>
+      <w:r>
+        <w:rPr>
+          <w:rFonts w:ascii="Times New Roman" w:hAnsi="Times New Roman" w:cs="Times New Roman"/>
+          <w:color w:val="auto"/>
+          <w:sz w:val="24"/>
+          <w:szCs w:val="24"/>
+          <w:lang w:val="en-KE"/>
+        </w:rPr>
+        <w:t>Fig 2- One-Hot Encoding Output</w:t>
       </w:r>
       <w:bookmarkEnd w:id="31"/>
     </w:p>
@@ -7682,12 +8171,13 @@
       <w:r>
         <w:rPr>
           <w:rFonts w:ascii="Times New Roman" w:hAnsi="Times New Roman" w:cs="Times New Roman"/>
+          <w:noProof/>
           <w:sz w:val="24"/>
           <w:szCs w:val="24"/>
           <w:lang w:val="en-KE"/>
         </w:rPr>
         <w:drawing>
-          <wp:inline distT="0" distB="0" distL="0" distR="0" wp14:anchorId="1F4A5D60" wp14:editId="502BF4A3">
+          <wp:inline distT="0" distB="0" distL="0" distR="0" wp14:anchorId="1F4A5D60" wp14:editId="1A9F7431">
             <wp:extent cx="5943600" cy="1661795"/>
             <wp:effectExtent l="0" t="0" r="0" b="0"/>
             <wp:docPr id="1149711257" name="Picture 3"/>
@@ -7747,7 +8237,7 @@
           <w:lang w:val="en-KE"/>
         </w:rPr>
       </w:pPr>
-      <w:bookmarkStart w:id="32" w:name="_Toc232646142"/>
+      <w:bookmarkStart w:id="32" w:name="_Toc233315786"/>
       <w:r>
         <w:rPr>
           <w:rFonts w:ascii="Times New Roman" w:hAnsi="Times New Roman" w:cs="Times New Roman"/>
@@ -7757,27 +8247,7 @@
           <w:lang w:val="en-KE"/>
         </w:rPr>
         <w:lastRenderedPageBreak/>
-        <w:t>Fig 3</w:t>
-      </w:r>
-      <w:r>
-        <w:rPr>
-          <w:rFonts w:ascii="Times New Roman" w:hAnsi="Times New Roman" w:cs="Times New Roman"/>
-          <w:color w:val="auto"/>
-          <w:sz w:val="24"/>
-          <w:szCs w:val="24"/>
-          <w:lang w:val="en-KE"/>
-        </w:rPr>
-        <w:t>-</w:t>
-      </w:r>
-      <w:r>
-        <w:rPr>
-          <w:rFonts w:ascii="Times New Roman" w:hAnsi="Times New Roman" w:cs="Times New Roman"/>
-          <w:color w:val="auto"/>
-          <w:sz w:val="24"/>
-          <w:szCs w:val="24"/>
-          <w:lang w:val="en-KE"/>
-        </w:rPr>
-        <w:t xml:space="preserve"> Word2Vec Training Output</w:t>
+        <w:t>Fig 3- Word2Vec Training Output</w:t>
       </w:r>
       <w:bookmarkEnd w:id="32"/>
     </w:p>
@@ -7793,6 +8263,7 @@
       <w:r>
         <w:rPr>
           <w:rFonts w:ascii="Times New Roman" w:hAnsi="Times New Roman" w:cs="Times New Roman"/>
+          <w:noProof/>
           <w:sz w:val="24"/>
           <w:szCs w:val="24"/>
           <w:lang w:val="en-KE"/>
@@ -7858,36 +8329,16 @@
           <w:lang w:val="en-KE"/>
         </w:rPr>
       </w:pPr>
-      <w:bookmarkStart w:id="33" w:name="_Toc232646143"/>
-      <w:r>
-        <w:rPr>
-          <w:rFonts w:ascii="Times New Roman" w:hAnsi="Times New Roman" w:cs="Times New Roman"/>
-          <w:color w:val="auto"/>
-          <w:sz w:val="24"/>
-          <w:szCs w:val="24"/>
-          <w:lang w:val="en-KE"/>
-        </w:rPr>
-        <w:t>Fig 4</w:t>
-      </w:r>
-      <w:r>
-        <w:rPr>
-          <w:rFonts w:ascii="Times New Roman" w:hAnsi="Times New Roman" w:cs="Times New Roman"/>
-          <w:color w:val="auto"/>
-          <w:sz w:val="24"/>
-          <w:szCs w:val="24"/>
-          <w:lang w:val="en-KE"/>
-        </w:rPr>
-        <w:t>-</w:t>
-      </w:r>
-      <w:r>
-        <w:rPr>
-          <w:rFonts w:ascii="Times New Roman" w:hAnsi="Times New Roman" w:cs="Times New Roman"/>
-          <w:color w:val="auto"/>
-          <w:sz w:val="24"/>
-          <w:szCs w:val="24"/>
-          <w:lang w:val="en-KE"/>
-        </w:rPr>
-        <w:t xml:space="preserve"> Similarity Scores Output</w:t>
+      <w:bookmarkStart w:id="33" w:name="_Toc233315787"/>
+      <w:r>
+        <w:rPr>
+          <w:rFonts w:ascii="Times New Roman" w:hAnsi="Times New Roman" w:cs="Times New Roman"/>
+          <w:color w:val="auto"/>
+          <w:sz w:val="24"/>
+          <w:szCs w:val="24"/>
+          <w:lang w:val="en-KE"/>
+        </w:rPr>
+        <w:t>Fig 4- Similarity Scores Output</w:t>
       </w:r>
       <w:bookmarkEnd w:id="33"/>
     </w:p>
@@ -7903,6 +8354,7 @@
       <w:r>
         <w:rPr>
           <w:rFonts w:ascii="Times New Roman" w:hAnsi="Times New Roman" w:cs="Times New Roman"/>
+          <w:noProof/>
           <w:sz w:val="24"/>
           <w:szCs w:val="24"/>
           <w:lang w:val="en-KE"/>
@@ -7987,6 +8439,7 @@
       <w:r>
         <w:rPr>
           <w:rFonts w:ascii="Times New Roman" w:hAnsi="Times New Roman" w:cs="Times New Roman"/>
+          <w:noProof/>
           <w:sz w:val="24"/>
           <w:szCs w:val="24"/>
           <w:lang w:val="en-KE"/>
@@ -8071,6 +8524,7 @@
       <w:r>
         <w:rPr>
           <w:rFonts w:ascii="Times New Roman" w:hAnsi="Times New Roman" w:cs="Times New Roman"/>
+          <w:noProof/>
           <w:sz w:val="24"/>
           <w:szCs w:val="24"/>
           <w:lang w:val="en-KE"/>
@@ -8136,7 +8590,7 @@
           <w:lang w:val="en-KE"/>
         </w:rPr>
       </w:pPr>
-      <w:bookmarkStart w:id="34" w:name="_Toc232646144"/>
+      <w:bookmarkStart w:id="34" w:name="_Toc233315788"/>
       <w:r>
         <w:rPr>
           <w:rFonts w:ascii="Times New Roman" w:hAnsi="Times New Roman" w:cs="Times New Roman"/>
@@ -8146,27 +8600,7 @@
           <w:lang w:val="en-KE"/>
         </w:rPr>
         <w:lastRenderedPageBreak/>
-        <w:t>Fig 5</w:t>
-      </w:r>
-      <w:r>
-        <w:rPr>
-          <w:rFonts w:ascii="Times New Roman" w:hAnsi="Times New Roman" w:cs="Times New Roman"/>
-          <w:color w:val="auto"/>
-          <w:sz w:val="24"/>
-          <w:szCs w:val="24"/>
-          <w:lang w:val="en-KE"/>
-        </w:rPr>
-        <w:t>-</w:t>
-      </w:r>
-      <w:r>
-        <w:rPr>
-          <w:rFonts w:ascii="Times New Roman" w:hAnsi="Times New Roman" w:cs="Times New Roman"/>
-          <w:color w:val="auto"/>
-          <w:sz w:val="24"/>
-          <w:szCs w:val="24"/>
-          <w:lang w:val="en-KE"/>
-        </w:rPr>
-        <w:t xml:space="preserve"> PCA Word Embedding Visualisation</w:t>
+        <w:t>Fig 5- PCA Word Embedding Visualisation</w:t>
       </w:r>
       <w:bookmarkEnd w:id="34"/>
     </w:p>
@@ -8182,12 +8616,13 @@
       <w:r>
         <w:rPr>
           <w:rFonts w:ascii="Times New Roman" w:hAnsi="Times New Roman" w:cs="Times New Roman"/>
+          <w:noProof/>
           <w:sz w:val="24"/>
           <w:szCs w:val="24"/>
           <w:lang w:val="en-KE"/>
         </w:rPr>
         <w:drawing>
-          <wp:inline distT="0" distB="0" distL="0" distR="0" wp14:anchorId="0B929151" wp14:editId="0EA78E24">
+          <wp:inline distT="0" distB="0" distL="0" distR="0" wp14:anchorId="0B929151" wp14:editId="225B10C7">
             <wp:extent cx="5943600" cy="2404745"/>
             <wp:effectExtent l="0" t="0" r="0" b="0"/>
             <wp:docPr id="1029648896" name="Picture 8"/>
@@ -8247,36 +8682,16 @@
           <w:lang w:val="en-KE"/>
         </w:rPr>
       </w:pPr>
-      <w:bookmarkStart w:id="35" w:name="_Toc232646145"/>
-      <w:r>
-        <w:rPr>
-          <w:rFonts w:ascii="Times New Roman" w:hAnsi="Times New Roman" w:cs="Times New Roman"/>
-          <w:color w:val="auto"/>
-          <w:sz w:val="24"/>
-          <w:szCs w:val="24"/>
-          <w:lang w:val="en-KE"/>
-        </w:rPr>
-        <w:t>Fig 6</w:t>
-      </w:r>
-      <w:r>
-        <w:rPr>
-          <w:rFonts w:ascii="Times New Roman" w:hAnsi="Times New Roman" w:cs="Times New Roman"/>
-          <w:color w:val="auto"/>
-          <w:sz w:val="24"/>
-          <w:szCs w:val="24"/>
-          <w:lang w:val="en-KE"/>
-        </w:rPr>
-        <w:t>-</w:t>
-      </w:r>
-      <w:r>
-        <w:rPr>
-          <w:rFonts w:ascii="Times New Roman" w:hAnsi="Times New Roman" w:cs="Times New Roman"/>
-          <w:color w:val="auto"/>
-          <w:sz w:val="24"/>
-          <w:szCs w:val="24"/>
-          <w:lang w:val="en-KE"/>
-        </w:rPr>
-        <w:t xml:space="preserve"> Comparison Report</w:t>
+      <w:bookmarkStart w:id="35" w:name="_Toc233315789"/>
+      <w:r>
+        <w:rPr>
+          <w:rFonts w:ascii="Times New Roman" w:hAnsi="Times New Roman" w:cs="Times New Roman"/>
+          <w:color w:val="auto"/>
+          <w:sz w:val="24"/>
+          <w:szCs w:val="24"/>
+          <w:lang w:val="en-KE"/>
+        </w:rPr>
+        <w:t>Fig 6- Comparison Report</w:t>
       </w:r>
       <w:bookmarkEnd w:id="35"/>
     </w:p>
@@ -8292,6 +8707,7 @@
       <w:r>
         <w:rPr>
           <w:rFonts w:ascii="Times New Roman" w:hAnsi="Times New Roman" w:cs="Times New Roman"/>
+          <w:noProof/>
           <w:sz w:val="24"/>
           <w:szCs w:val="24"/>
           <w:lang w:val="en-KE"/>
@@ -8367,36 +8783,16 @@
           <w:lang w:val="en-KE"/>
         </w:rPr>
       </w:pPr>
-      <w:bookmarkStart w:id="36" w:name="_Toc232646146"/>
-      <w:r>
-        <w:rPr>
-          <w:rFonts w:ascii="Times New Roman" w:hAnsi="Times New Roman" w:cs="Times New Roman"/>
-          <w:color w:val="auto"/>
-          <w:sz w:val="24"/>
-          <w:szCs w:val="24"/>
-          <w:lang w:val="en-KE"/>
-        </w:rPr>
-        <w:t>Fig 7</w:t>
-      </w:r>
-      <w:r>
-        <w:rPr>
-          <w:rFonts w:ascii="Times New Roman" w:hAnsi="Times New Roman" w:cs="Times New Roman"/>
-          <w:color w:val="auto"/>
-          <w:sz w:val="24"/>
-          <w:szCs w:val="24"/>
-          <w:lang w:val="en-KE"/>
-        </w:rPr>
-        <w:t>-</w:t>
-      </w:r>
-      <w:r>
-        <w:rPr>
-          <w:rFonts w:ascii="Times New Roman" w:hAnsi="Times New Roman" w:cs="Times New Roman"/>
-          <w:color w:val="auto"/>
-          <w:sz w:val="24"/>
-          <w:szCs w:val="24"/>
-          <w:lang w:val="en-KE"/>
-        </w:rPr>
-        <w:t xml:space="preserve"> CBOW vs Skip-Gram</w:t>
+      <w:bookmarkStart w:id="36" w:name="_Toc233315790"/>
+      <w:r>
+        <w:rPr>
+          <w:rFonts w:ascii="Times New Roman" w:hAnsi="Times New Roman" w:cs="Times New Roman"/>
+          <w:color w:val="auto"/>
+          <w:sz w:val="24"/>
+          <w:szCs w:val="24"/>
+          <w:lang w:val="en-KE"/>
+        </w:rPr>
+        <w:t>Fig 7- CBOW vs Skip-Gram</w:t>
       </w:r>
       <w:bookmarkEnd w:id="36"/>
     </w:p>
@@ -8421,7 +8817,7 @@
           <w:lang w:val="en-KE"/>
         </w:rPr>
       </w:pPr>
-      <w:bookmarkStart w:id="37" w:name="_Toc232646147"/>
+      <w:bookmarkStart w:id="37" w:name="_Toc233315791"/>
       <w:r>
         <w:rPr>
           <w:rFonts w:ascii="Times New Roman" w:hAnsi="Times New Roman" w:cs="Times New Roman"/>
@@ -8459,16 +8855,7 @@
           <w:szCs w:val="24"/>
           <w:lang w:val="en-KE"/>
         </w:rPr>
-        <w:t xml:space="preserve">eek </w:t>
-      </w:r>
-      <w:r>
-        <w:rPr>
-          <w:rFonts w:ascii="Times New Roman" w:hAnsi="Times New Roman" w:cs="Times New Roman"/>
-          <w:sz w:val="24"/>
-          <w:szCs w:val="24"/>
-          <w:lang w:val="en-KE"/>
-        </w:rPr>
-        <w:t>6</w:t>
+        <w:t>eek 6</w:t>
       </w:r>
       <w:r>
         <w:rPr>
@@ -8702,7 +9089,7 @@
           <w:lang w:val="en-KE"/>
         </w:rPr>
       </w:pPr>
-      <w:bookmarkStart w:id="38" w:name="_Toc232646148"/>
+      <w:bookmarkStart w:id="38" w:name="_Toc233315792"/>
       <w:r>
         <w:rPr>
           <w:rFonts w:ascii="Times New Roman" w:hAnsi="Times New Roman" w:cs="Times New Roman"/>
@@ -8730,6 +9117,7 @@
       <w:r>
         <w:rPr>
           <w:rFonts w:ascii="Times New Roman" w:hAnsi="Times New Roman" w:cs="Times New Roman"/>
+          <w:noProof/>
           <w:sz w:val="24"/>
           <w:szCs w:val="24"/>
           <w:lang w:val="en-KE"/>
@@ -8795,36 +9183,16 @@
           <w:lang w:val="en-KE"/>
         </w:rPr>
       </w:pPr>
-      <w:bookmarkStart w:id="39" w:name="_Toc232646149"/>
-      <w:r>
-        <w:rPr>
-          <w:rFonts w:ascii="Times New Roman" w:hAnsi="Times New Roman" w:cs="Times New Roman"/>
-          <w:color w:val="auto"/>
-          <w:sz w:val="24"/>
-          <w:szCs w:val="24"/>
-          <w:lang w:val="en-KE"/>
-        </w:rPr>
-        <w:t>Fig 1</w:t>
-      </w:r>
-      <w:r>
-        <w:rPr>
-          <w:rFonts w:ascii="Times New Roman" w:hAnsi="Times New Roman" w:cs="Times New Roman"/>
-          <w:color w:val="auto"/>
-          <w:sz w:val="24"/>
-          <w:szCs w:val="24"/>
-          <w:lang w:val="en-KE"/>
-        </w:rPr>
-        <w:t>-</w:t>
-      </w:r>
-      <w:r>
-        <w:rPr>
-          <w:rFonts w:ascii="Times New Roman" w:hAnsi="Times New Roman" w:cs="Times New Roman"/>
-          <w:color w:val="auto"/>
-          <w:sz w:val="24"/>
-          <w:szCs w:val="24"/>
-          <w:lang w:val="en-KE"/>
-        </w:rPr>
-        <w:t xml:space="preserve"> TensorFlow Installation</w:t>
+      <w:bookmarkStart w:id="39" w:name="_Toc233315793"/>
+      <w:r>
+        <w:rPr>
+          <w:rFonts w:ascii="Times New Roman" w:hAnsi="Times New Roman" w:cs="Times New Roman"/>
+          <w:color w:val="auto"/>
+          <w:sz w:val="24"/>
+          <w:szCs w:val="24"/>
+          <w:lang w:val="en-KE"/>
+        </w:rPr>
+        <w:t>Fig 1- TensorFlow Installation</w:t>
       </w:r>
       <w:bookmarkEnd w:id="39"/>
     </w:p>
@@ -8840,12 +9208,13 @@
       <w:r>
         <w:rPr>
           <w:rFonts w:ascii="Times New Roman" w:hAnsi="Times New Roman" w:cs="Times New Roman"/>
+          <w:noProof/>
           <w:sz w:val="24"/>
           <w:szCs w:val="24"/>
           <w:lang w:val="en-KE"/>
         </w:rPr>
         <w:drawing>
-          <wp:inline distT="0" distB="0" distL="0" distR="0" wp14:anchorId="1E6BFBD6" wp14:editId="442D0863">
+          <wp:inline distT="0" distB="0" distL="0" distR="0" wp14:anchorId="1E6BFBD6" wp14:editId="05B5967E">
             <wp:extent cx="5943600" cy="2270125"/>
             <wp:effectExtent l="0" t="0" r="0" b="0"/>
             <wp:docPr id="1173094139" name="Picture 11"/>
@@ -8905,36 +9274,16 @@
           <w:lang w:val="en-KE"/>
         </w:rPr>
       </w:pPr>
-      <w:bookmarkStart w:id="40" w:name="_Toc232646150"/>
-      <w:r>
-        <w:rPr>
-          <w:rFonts w:ascii="Times New Roman" w:hAnsi="Times New Roman" w:cs="Times New Roman"/>
-          <w:color w:val="auto"/>
-          <w:sz w:val="24"/>
-          <w:szCs w:val="24"/>
-          <w:lang w:val="en-KE"/>
-        </w:rPr>
-        <w:t>Fig 2</w:t>
-      </w:r>
-      <w:r>
-        <w:rPr>
-          <w:rFonts w:ascii="Times New Roman" w:hAnsi="Times New Roman" w:cs="Times New Roman"/>
-          <w:color w:val="auto"/>
-          <w:sz w:val="24"/>
-          <w:szCs w:val="24"/>
-          <w:lang w:val="en-KE"/>
-        </w:rPr>
-        <w:t>-</w:t>
-      </w:r>
-      <w:r>
-        <w:rPr>
-          <w:rFonts w:ascii="Times New Roman" w:hAnsi="Times New Roman" w:cs="Times New Roman"/>
-          <w:color w:val="auto"/>
-          <w:sz w:val="24"/>
-          <w:szCs w:val="24"/>
-          <w:lang w:val="en-KE"/>
-        </w:rPr>
-        <w:t xml:space="preserve"> Neural Network Summary</w:t>
+      <w:bookmarkStart w:id="40" w:name="_Toc233315794"/>
+      <w:r>
+        <w:rPr>
+          <w:rFonts w:ascii="Times New Roman" w:hAnsi="Times New Roman" w:cs="Times New Roman"/>
+          <w:color w:val="auto"/>
+          <w:sz w:val="24"/>
+          <w:szCs w:val="24"/>
+          <w:lang w:val="en-KE"/>
+        </w:rPr>
+        <w:t>Fig 2- Neural Network Summary</w:t>
       </w:r>
       <w:bookmarkEnd w:id="40"/>
     </w:p>
@@ -8950,12 +9299,13 @@
       <w:r>
         <w:rPr>
           <w:rFonts w:ascii="Times New Roman" w:hAnsi="Times New Roman" w:cs="Times New Roman"/>
+          <w:noProof/>
           <w:sz w:val="24"/>
           <w:szCs w:val="24"/>
           <w:lang w:val="en-KE"/>
         </w:rPr>
         <w:drawing>
-          <wp:inline distT="0" distB="0" distL="0" distR="0" wp14:anchorId="58D6C7EF" wp14:editId="31C09551">
+          <wp:inline distT="0" distB="0" distL="0" distR="0" wp14:anchorId="58D6C7EF" wp14:editId="4EB15FD0">
             <wp:extent cx="5943600" cy="2429510"/>
             <wp:effectExtent l="0" t="0" r="0" b="8890"/>
             <wp:docPr id="70701416" name="Picture 12"/>
@@ -9015,7 +9365,7 @@
           <w:lang w:val="en-KE"/>
         </w:rPr>
       </w:pPr>
-      <w:bookmarkStart w:id="41" w:name="_Toc232646151"/>
+      <w:bookmarkStart w:id="41" w:name="_Toc233315795"/>
       <w:r>
         <w:rPr>
           <w:rFonts w:ascii="Times New Roman" w:hAnsi="Times New Roman" w:cs="Times New Roman"/>
@@ -9025,27 +9375,7 @@
           <w:lang w:val="en-KE"/>
         </w:rPr>
         <w:lastRenderedPageBreak/>
-        <w:t>Fig 3</w:t>
-      </w:r>
-      <w:r>
-        <w:rPr>
-          <w:rFonts w:ascii="Times New Roman" w:hAnsi="Times New Roman" w:cs="Times New Roman"/>
-          <w:color w:val="auto"/>
-          <w:sz w:val="24"/>
-          <w:szCs w:val="24"/>
-          <w:lang w:val="en-KE"/>
-        </w:rPr>
-        <w:t>-</w:t>
-      </w:r>
-      <w:r>
-        <w:rPr>
-          <w:rFonts w:ascii="Times New Roman" w:hAnsi="Times New Roman" w:cs="Times New Roman"/>
-          <w:color w:val="auto"/>
-          <w:sz w:val="24"/>
-          <w:szCs w:val="24"/>
-          <w:lang w:val="en-KE"/>
-        </w:rPr>
-        <w:t xml:space="preserve"> Tokenization and Sequences</w:t>
+        <w:t>Fig 3- Tokenization and Sequences</w:t>
       </w:r>
       <w:bookmarkEnd w:id="41"/>
     </w:p>
@@ -9061,12 +9391,13 @@
       <w:r>
         <w:rPr>
           <w:rFonts w:ascii="Times New Roman" w:hAnsi="Times New Roman" w:cs="Times New Roman"/>
+          <w:noProof/>
           <w:sz w:val="24"/>
           <w:szCs w:val="24"/>
           <w:lang w:val="en-KE"/>
         </w:rPr>
         <w:drawing>
-          <wp:inline distT="0" distB="0" distL="0" distR="0" wp14:anchorId="4367E566" wp14:editId="70EF91FD">
+          <wp:inline distT="0" distB="0" distL="0" distR="0" wp14:anchorId="4367E566" wp14:editId="7449CFAF">
             <wp:extent cx="5943600" cy="2691765"/>
             <wp:effectExtent l="0" t="0" r="0" b="0"/>
             <wp:docPr id="519465621" name="Picture 13"/>
@@ -9126,36 +9457,16 @@
           <w:lang w:val="en-KE"/>
         </w:rPr>
       </w:pPr>
-      <w:bookmarkStart w:id="42" w:name="_Toc232646152"/>
-      <w:r>
-        <w:rPr>
-          <w:rFonts w:ascii="Times New Roman" w:hAnsi="Times New Roman" w:cs="Times New Roman"/>
-          <w:color w:val="auto"/>
-          <w:sz w:val="24"/>
-          <w:szCs w:val="24"/>
-          <w:lang w:val="en-KE"/>
-        </w:rPr>
-        <w:t>Fig 4</w:t>
-      </w:r>
-      <w:r>
-        <w:rPr>
-          <w:rFonts w:ascii="Times New Roman" w:hAnsi="Times New Roman" w:cs="Times New Roman"/>
-          <w:color w:val="auto"/>
-          <w:sz w:val="24"/>
-          <w:szCs w:val="24"/>
-          <w:lang w:val="en-KE"/>
-        </w:rPr>
-        <w:t>-</w:t>
-      </w:r>
-      <w:r>
-        <w:rPr>
-          <w:rFonts w:ascii="Times New Roman" w:hAnsi="Times New Roman" w:cs="Times New Roman"/>
-          <w:color w:val="auto"/>
-          <w:sz w:val="24"/>
-          <w:szCs w:val="24"/>
-          <w:lang w:val="en-KE"/>
-        </w:rPr>
-        <w:t xml:space="preserve"> Model Built and Summary</w:t>
+      <w:bookmarkStart w:id="42" w:name="_Toc233315796"/>
+      <w:r>
+        <w:rPr>
+          <w:rFonts w:ascii="Times New Roman" w:hAnsi="Times New Roman" w:cs="Times New Roman"/>
+          <w:color w:val="auto"/>
+          <w:sz w:val="24"/>
+          <w:szCs w:val="24"/>
+          <w:lang w:val="en-KE"/>
+        </w:rPr>
+        <w:t>Fig 4- Model Built and Summary</w:t>
       </w:r>
       <w:bookmarkEnd w:id="42"/>
     </w:p>
@@ -9171,6 +9482,7 @@
       <w:r>
         <w:rPr>
           <w:rFonts w:ascii="Times New Roman" w:hAnsi="Times New Roman" w:cs="Times New Roman"/>
+          <w:noProof/>
           <w:sz w:val="24"/>
           <w:szCs w:val="24"/>
           <w:lang w:val="en-KE"/>
@@ -9236,7 +9548,7 @@
           <w:lang w:val="en-KE"/>
         </w:rPr>
       </w:pPr>
-      <w:bookmarkStart w:id="43" w:name="_Toc232646153"/>
+      <w:bookmarkStart w:id="43" w:name="_Toc233315797"/>
       <w:r>
         <w:rPr>
           <w:rFonts w:ascii="Times New Roman" w:hAnsi="Times New Roman" w:cs="Times New Roman"/>
@@ -9246,27 +9558,7 @@
           <w:lang w:val="en-KE"/>
         </w:rPr>
         <w:lastRenderedPageBreak/>
-        <w:t>Fig 5</w:t>
-      </w:r>
-      <w:r>
-        <w:rPr>
-          <w:rFonts w:ascii="Times New Roman" w:hAnsi="Times New Roman" w:cs="Times New Roman"/>
-          <w:color w:val="auto"/>
-          <w:sz w:val="24"/>
-          <w:szCs w:val="24"/>
-          <w:lang w:val="en-KE"/>
-        </w:rPr>
-        <w:t>-</w:t>
-      </w:r>
-      <w:r>
-        <w:rPr>
-          <w:rFonts w:ascii="Times New Roman" w:hAnsi="Times New Roman" w:cs="Times New Roman"/>
-          <w:color w:val="auto"/>
-          <w:sz w:val="24"/>
-          <w:szCs w:val="24"/>
-          <w:lang w:val="en-KE"/>
-        </w:rPr>
-        <w:t xml:space="preserve"> Training Progress</w:t>
+        <w:t>Fig 5- Training Progress</w:t>
       </w:r>
       <w:bookmarkEnd w:id="43"/>
     </w:p>
@@ -9282,6 +9574,7 @@
       <w:r>
         <w:rPr>
           <w:rFonts w:ascii="Times New Roman" w:hAnsi="Times New Roman" w:cs="Times New Roman"/>
+          <w:noProof/>
           <w:sz w:val="24"/>
           <w:szCs w:val="24"/>
           <w:lang w:val="en-KE"/>
@@ -9347,36 +9640,16 @@
           <w:lang w:val="en-KE"/>
         </w:rPr>
       </w:pPr>
-      <w:bookmarkStart w:id="44" w:name="_Toc232646154"/>
-      <w:r>
-        <w:rPr>
-          <w:rFonts w:ascii="Times New Roman" w:hAnsi="Times New Roman" w:cs="Times New Roman"/>
-          <w:color w:val="auto"/>
-          <w:sz w:val="24"/>
-          <w:szCs w:val="24"/>
-          <w:lang w:val="en-KE"/>
-        </w:rPr>
-        <w:t>Fig 6</w:t>
-      </w:r>
-      <w:r>
-        <w:rPr>
-          <w:rFonts w:ascii="Times New Roman" w:hAnsi="Times New Roman" w:cs="Times New Roman"/>
-          <w:color w:val="auto"/>
-          <w:sz w:val="24"/>
-          <w:szCs w:val="24"/>
-          <w:lang w:val="en-KE"/>
-        </w:rPr>
-        <w:t>-</w:t>
-      </w:r>
-      <w:r>
-        <w:rPr>
-          <w:rFonts w:ascii="Times New Roman" w:hAnsi="Times New Roman" w:cs="Times New Roman"/>
-          <w:color w:val="auto"/>
-          <w:sz w:val="24"/>
-          <w:szCs w:val="24"/>
-          <w:lang w:val="en-KE"/>
-        </w:rPr>
-        <w:t xml:space="preserve"> Next Word Predictions</w:t>
+      <w:bookmarkStart w:id="44" w:name="_Toc233315798"/>
+      <w:r>
+        <w:rPr>
+          <w:rFonts w:ascii="Times New Roman" w:hAnsi="Times New Roman" w:cs="Times New Roman"/>
+          <w:color w:val="auto"/>
+          <w:sz w:val="24"/>
+          <w:szCs w:val="24"/>
+          <w:lang w:val="en-KE"/>
+        </w:rPr>
+        <w:t>Fig 6- Next Word Predictions</w:t>
       </w:r>
       <w:bookmarkEnd w:id="44"/>
     </w:p>
@@ -9392,12 +9665,13 @@
       <w:r>
         <w:rPr>
           <w:rFonts w:ascii="Times New Roman" w:hAnsi="Times New Roman" w:cs="Times New Roman"/>
+          <w:noProof/>
           <w:sz w:val="24"/>
           <w:szCs w:val="24"/>
           <w:lang w:val="en-KE"/>
         </w:rPr>
         <w:drawing>
-          <wp:inline distT="0" distB="0" distL="0" distR="0" wp14:anchorId="313B6EE5" wp14:editId="1727E7AD">
+          <wp:inline distT="0" distB="0" distL="0" distR="0" wp14:anchorId="313B6EE5" wp14:editId="2BD061EF">
             <wp:extent cx="5943600" cy="2009775"/>
             <wp:effectExtent l="0" t="0" r="0" b="9525"/>
             <wp:docPr id="1693713678" name="Picture 16"/>
@@ -9457,7 +9731,7 @@
           <w:lang w:val="en-KE"/>
         </w:rPr>
       </w:pPr>
-      <w:bookmarkStart w:id="45" w:name="_Toc232646155"/>
+      <w:bookmarkStart w:id="45" w:name="_Toc233315799"/>
       <w:r>
         <w:rPr>
           <w:rFonts w:ascii="Times New Roman" w:hAnsi="Times New Roman" w:cs="Times New Roman"/>
@@ -9511,7 +9785,7 @@
           <w:lang w:val="en-KE"/>
         </w:rPr>
       </w:pPr>
-      <w:bookmarkStart w:id="46" w:name="_Toc232646156"/>
+      <w:bookmarkStart w:id="46" w:name="_Toc233315800"/>
       <w:r>
         <w:rPr>
           <w:rFonts w:ascii="Times New Roman" w:hAnsi="Times New Roman" w:cs="Times New Roman"/>
@@ -9538,23 +9812,7 @@
           <w:sz w:val="24"/>
           <w:szCs w:val="24"/>
         </w:rPr>
-        <w:t xml:space="preserve">Week 7 introduced Neural Language Models as an improvement over traditional N-gram </w:t>
-      </w:r>
-      <w:r>
-        <w:rPr>
-          <w:rFonts w:ascii="Times New Roman" w:hAnsi="Times New Roman" w:cs="Times New Roman"/>
-          <w:sz w:val="24"/>
-          <w:szCs w:val="24"/>
-        </w:rPr>
-        <w:t>approach</w:t>
-      </w:r>
-      <w:r>
-        <w:rPr>
-          <w:rFonts w:ascii="Times New Roman" w:hAnsi="Times New Roman" w:cs="Times New Roman"/>
-          <w:sz w:val="24"/>
-          <w:szCs w:val="24"/>
-        </w:rPr>
-        <w:t>.</w:t>
+        <w:t>Week 7 introduced Neural Language Models as an improvement over traditional N-gram approach.</w:t>
       </w:r>
       <w:r>
         <w:rPr>
@@ -9588,23 +9846,7 @@
           <w:sz w:val="24"/>
           <w:szCs w:val="24"/>
         </w:rPr>
-        <w:t xml:space="preserve"> Tokenizer which converted words into something that could be understood by a machine. Fig 4 and 5 built and trained a complete LSTM based Neural Language Model that learned to predict the next word from a sequence, with the result being a high training accuracy after 100 epochs. Fig 6 tested this model using new phrases and returned the top three predicted words in order of confidence. Fig 7 compared N-gram models with the Neural Language Models, and showed that the latter </w:t>
-      </w:r>
-      <w:r>
-        <w:rPr>
-          <w:rFonts w:ascii="Times New Roman" w:hAnsi="Times New Roman" w:cs="Times New Roman"/>
-          <w:sz w:val="24"/>
-          <w:szCs w:val="24"/>
-        </w:rPr>
-        <w:t>generalized</w:t>
-      </w:r>
-      <w:r>
-        <w:rPr>
-          <w:rFonts w:ascii="Times New Roman" w:hAnsi="Times New Roman" w:cs="Times New Roman"/>
-          <w:sz w:val="24"/>
-          <w:szCs w:val="24"/>
-        </w:rPr>
-        <w:t xml:space="preserve"> better to unseen word combinations, because they learnt semantic relationships, rather than the exact word count.</w:t>
+        <w:t xml:space="preserve"> Tokenizer which converted words into something that could be understood by a machine. Fig 4 and 5 built and trained a complete LSTM based Neural Language Model that learned to predict the next word from a sequence, with the result being a high training accuracy after 100 epochs. Fig 6 tested this model using new phrases and returned the top three predicted words in order of confidence. Fig 7 compared N-gram models with the Neural Language Models, and showed that the latter generalized better to unseen word combinations, because they learnt semantic relationships, rather than the exact word count.</w:t>
       </w:r>
     </w:p>
     <w:p>
@@ -9619,7 +9861,7 @@
           <w:szCs w:val="28"/>
         </w:rPr>
       </w:pPr>
-      <w:bookmarkStart w:id="47" w:name="_Toc232646157"/>
+      <w:bookmarkStart w:id="47" w:name="_Toc233315801"/>
       <w:r>
         <w:rPr>
           <w:rFonts w:ascii="Times New Roman" w:hAnsi="Times New Roman" w:cs="Times New Roman"/>
@@ -9646,12 +9888,13 @@
       <w:r>
         <w:rPr>
           <w:rFonts w:ascii="Times New Roman" w:hAnsi="Times New Roman" w:cs="Times New Roman"/>
+          <w:noProof/>
           <w:sz w:val="24"/>
           <w:szCs w:val="24"/>
           <w:lang w:val="en-KE"/>
         </w:rPr>
         <w:drawing>
-          <wp:inline distT="0" distB="0" distL="0" distR="0" wp14:anchorId="7032B4E0" wp14:editId="52B64EFF">
+          <wp:inline distT="0" distB="0" distL="0" distR="0" wp14:anchorId="7032B4E0" wp14:editId="7AD08021">
             <wp:extent cx="5943600" cy="1395095"/>
             <wp:effectExtent l="0" t="0" r="0" b="0"/>
             <wp:docPr id="270790915" name="Picture 19"/>
@@ -9710,33 +9953,15 @@
           <w:szCs w:val="24"/>
         </w:rPr>
       </w:pPr>
-      <w:bookmarkStart w:id="48" w:name="_Toc232646158"/>
-      <w:r>
-        <w:rPr>
-          <w:rFonts w:ascii="Times New Roman" w:hAnsi="Times New Roman" w:cs="Times New Roman"/>
-          <w:color w:val="auto"/>
-          <w:sz w:val="24"/>
-          <w:szCs w:val="24"/>
-        </w:rPr>
-        <w:t>Fig 1</w:t>
-      </w:r>
-      <w:r>
-        <w:rPr>
-          <w:rFonts w:ascii="Times New Roman" w:hAnsi="Times New Roman" w:cs="Times New Roman"/>
-          <w:color w:val="auto"/>
-          <w:sz w:val="24"/>
-          <w:szCs w:val="24"/>
-        </w:rPr>
-        <w:t>-</w:t>
-      </w:r>
-      <w:r>
-        <w:rPr>
-          <w:rFonts w:ascii="Times New Roman" w:hAnsi="Times New Roman" w:cs="Times New Roman"/>
-          <w:color w:val="auto"/>
-          <w:sz w:val="24"/>
-          <w:szCs w:val="24"/>
-        </w:rPr>
-        <w:t xml:space="preserve"> </w:t>
+      <w:bookmarkStart w:id="48" w:name="_Toc233315802"/>
+      <w:r>
+        <w:rPr>
+          <w:rFonts w:ascii="Times New Roman" w:hAnsi="Times New Roman" w:cs="Times New Roman"/>
+          <w:color w:val="auto"/>
+          <w:sz w:val="24"/>
+          <w:szCs w:val="24"/>
+        </w:rPr>
+        <w:t xml:space="preserve">Fig 1- </w:t>
       </w:r>
       <w:proofErr w:type="spellStart"/>
       <w:r>
@@ -9772,6 +9997,7 @@
       <w:r>
         <w:rPr>
           <w:rFonts w:ascii="Times New Roman" w:hAnsi="Times New Roman" w:cs="Times New Roman"/>
+          <w:noProof/>
           <w:sz w:val="24"/>
           <w:szCs w:val="24"/>
           <w:lang w:val="en-KE"/>
@@ -9836,7 +10062,7 @@
           <w:szCs w:val="24"/>
         </w:rPr>
       </w:pPr>
-      <w:bookmarkStart w:id="49" w:name="_Toc232646159"/>
+      <w:bookmarkStart w:id="49" w:name="_Toc233315803"/>
       <w:r>
         <w:rPr>
           <w:rFonts w:ascii="Times New Roman" w:hAnsi="Times New Roman" w:cs="Times New Roman"/>
@@ -9845,25 +10071,7 @@
           <w:szCs w:val="24"/>
         </w:rPr>
         <w:lastRenderedPageBreak/>
-        <w:t xml:space="preserve">Fig </w:t>
-      </w:r>
-      <w:r>
-        <w:rPr>
-          <w:rFonts w:ascii="Times New Roman" w:hAnsi="Times New Roman" w:cs="Times New Roman"/>
-          <w:color w:val="auto"/>
-          <w:sz w:val="24"/>
-          <w:szCs w:val="24"/>
-        </w:rPr>
-        <w:t>2-</w:t>
-      </w:r>
-      <w:r>
-        <w:rPr>
-          <w:rFonts w:ascii="Times New Roman" w:hAnsi="Times New Roman" w:cs="Times New Roman"/>
-          <w:color w:val="auto"/>
-          <w:sz w:val="24"/>
-          <w:szCs w:val="24"/>
-        </w:rPr>
-        <w:t xml:space="preserve"> Combined Model Built</w:t>
+        <w:t>Fig 2- Combined Model Built</w:t>
       </w:r>
       <w:bookmarkEnd w:id="49"/>
     </w:p>
@@ -9879,6 +10087,7 @@
       <w:r>
         <w:rPr>
           <w:rFonts w:ascii="Times New Roman" w:hAnsi="Times New Roman" w:cs="Times New Roman"/>
+          <w:noProof/>
           <w:sz w:val="24"/>
           <w:szCs w:val="24"/>
           <w:lang w:val="en-KE"/>
@@ -9943,33 +10152,15 @@
           <w:szCs w:val="24"/>
         </w:rPr>
       </w:pPr>
-      <w:bookmarkStart w:id="50" w:name="_Toc232646160"/>
-      <w:r>
-        <w:rPr>
-          <w:rFonts w:ascii="Times New Roman" w:hAnsi="Times New Roman" w:cs="Times New Roman"/>
-          <w:color w:val="auto"/>
-          <w:sz w:val="24"/>
-          <w:szCs w:val="24"/>
-        </w:rPr>
-        <w:t xml:space="preserve">Fig </w:t>
-      </w:r>
-      <w:r>
-        <w:rPr>
-          <w:rFonts w:ascii="Times New Roman" w:hAnsi="Times New Roman" w:cs="Times New Roman"/>
-          <w:color w:val="auto"/>
-          <w:sz w:val="24"/>
-          <w:szCs w:val="24"/>
-        </w:rPr>
-        <w:t>3-</w:t>
-      </w:r>
-      <w:r>
-        <w:rPr>
-          <w:rFonts w:ascii="Times New Roman" w:hAnsi="Times New Roman" w:cs="Times New Roman"/>
-          <w:color w:val="auto"/>
-          <w:sz w:val="24"/>
-          <w:szCs w:val="24"/>
-        </w:rPr>
-        <w:t xml:space="preserve"> Combined Model Predictions</w:t>
+      <w:bookmarkStart w:id="50" w:name="_Toc233315804"/>
+      <w:r>
+        <w:rPr>
+          <w:rFonts w:ascii="Times New Roman" w:hAnsi="Times New Roman" w:cs="Times New Roman"/>
+          <w:color w:val="auto"/>
+          <w:sz w:val="24"/>
+          <w:szCs w:val="24"/>
+        </w:rPr>
+        <w:t>Fig 3- Combined Model Predictions</w:t>
       </w:r>
       <w:bookmarkEnd w:id="50"/>
     </w:p>
@@ -9984,7 +10175,7 @@
           <w:szCs w:val="24"/>
         </w:rPr>
       </w:pPr>
-      <w:bookmarkStart w:id="51" w:name="_Toc232646161"/>
+      <w:bookmarkStart w:id="51" w:name="_Toc233315805"/>
       <w:r>
         <w:rPr>
           <w:rFonts w:ascii="Times New Roman" w:hAnsi="Times New Roman" w:cs="Times New Roman"/>
@@ -10012,6 +10203,912 @@
         </w:rPr>
         <w:t>The combination of these two methods (Week 6 and 7) in this creative project is indeed complementary; Word2Vec was used to build an embedding matrix and the LSTM was fine-tuned for the task of next-word prediction, showing that the Word2Vec and the neural language model are not two separate methods but two steps in one system, with Word2Vec being the first, and the second step being fine-tuning on the task. Fig 1 shows the combined architecture, where Word2Vec was used to build an embedding matrix, which was then loaded as pre-trained weights into an LSTM network. Fig 2 shows the training of this model and testing of next-word prediction; the model successfully learned sequences using word vectors that already understood meaning before training began.</w:t>
       </w:r>
+    </w:p>
+    <w:p>
+      <w:pPr>
+        <w:rPr>
+          <w:rFonts w:ascii="Times New Roman" w:hAnsi="Times New Roman" w:cs="Times New Roman"/>
+          <w:sz w:val="24"/>
+          <w:szCs w:val="24"/>
+        </w:rPr>
+      </w:pPr>
+    </w:p>
+    <w:p>
+      <w:pPr>
+        <w:rPr>
+          <w:rFonts w:ascii="Times New Roman" w:hAnsi="Times New Roman" w:cs="Times New Roman"/>
+          <w:sz w:val="24"/>
+          <w:szCs w:val="24"/>
+        </w:rPr>
+      </w:pPr>
+    </w:p>
+    <w:p>
+      <w:pPr>
+        <w:rPr>
+          <w:rFonts w:ascii="Times New Roman" w:hAnsi="Times New Roman" w:cs="Times New Roman"/>
+          <w:sz w:val="24"/>
+          <w:szCs w:val="24"/>
+        </w:rPr>
+      </w:pPr>
+    </w:p>
+    <w:p>
+      <w:pPr>
+        <w:rPr>
+          <w:rFonts w:ascii="Times New Roman" w:hAnsi="Times New Roman" w:cs="Times New Roman"/>
+          <w:sz w:val="24"/>
+          <w:szCs w:val="24"/>
+        </w:rPr>
+      </w:pPr>
+    </w:p>
+    <w:p>
+      <w:pPr>
+        <w:rPr>
+          <w:rFonts w:ascii="Times New Roman" w:hAnsi="Times New Roman" w:cs="Times New Roman"/>
+          <w:sz w:val="24"/>
+          <w:szCs w:val="24"/>
+        </w:rPr>
+      </w:pPr>
+    </w:p>
+    <w:p>
+      <w:pPr>
+        <w:pStyle w:val="Heading1"/>
+        <w:rPr>
+          <w:rFonts w:ascii="Times New Roman" w:hAnsi="Times New Roman" w:cs="Times New Roman"/>
+          <w:b/>
+          <w:bCs/>
+          <w:color w:val="auto"/>
+          <w:sz w:val="28"/>
+          <w:szCs w:val="28"/>
+        </w:rPr>
+      </w:pPr>
+      <w:bookmarkStart w:id="52" w:name="_Toc233315806"/>
+      <w:r>
+        <w:rPr>
+          <w:rFonts w:ascii="Times New Roman" w:hAnsi="Times New Roman" w:cs="Times New Roman"/>
+          <w:b/>
+          <w:bCs/>
+          <w:color w:val="auto"/>
+          <w:sz w:val="28"/>
+          <w:szCs w:val="28"/>
+        </w:rPr>
+        <w:lastRenderedPageBreak/>
+        <w:t>WEEK 8</w:t>
+      </w:r>
+      <w:bookmarkEnd w:id="52"/>
+    </w:p>
+    <w:p>
+      <w:pPr>
+        <w:rPr>
+          <w:rFonts w:ascii="Times New Roman" w:hAnsi="Times New Roman" w:cs="Times New Roman"/>
+          <w:sz w:val="24"/>
+          <w:szCs w:val="24"/>
+          <w:lang w:val="en-KE"/>
+        </w:rPr>
+      </w:pPr>
+      <w:r>
+        <w:rPr>
+          <w:rFonts w:ascii="Times New Roman" w:hAnsi="Times New Roman" w:cs="Times New Roman"/>
+          <w:noProof/>
+          <w:sz w:val="24"/>
+          <w:szCs w:val="24"/>
+          <w:lang w:val="en-KE"/>
+        </w:rPr>
+        <w:drawing>
+          <wp:inline distT="0" distB="0" distL="0" distR="0" wp14:anchorId="2F1DA443" wp14:editId="4FA4F9FF">
+            <wp:extent cx="5943600" cy="2419350"/>
+            <wp:effectExtent l="0" t="0" r="0" b="0"/>
+            <wp:docPr id="1448327608" name="Picture 3"/>
+            <wp:cNvGraphicFramePr>
+              <a:graphicFrameLocks xmlns:a="http://schemas.openxmlformats.org/drawingml/2006/main" noChangeAspect="1"/>
+            </wp:cNvGraphicFramePr>
+            <a:graphic xmlns:a="http://schemas.openxmlformats.org/drawingml/2006/main">
+              <a:graphicData uri="http://schemas.openxmlformats.org/drawingml/2006/picture">
+                <pic:pic xmlns:pic="http://schemas.openxmlformats.org/drawingml/2006/picture">
+                  <pic:nvPicPr>
+                    <pic:cNvPr id="0" name="Picture 1"/>
+                    <pic:cNvPicPr>
+                      <a:picLocks noChangeAspect="1" noChangeArrowheads="1"/>
+                    </pic:cNvPicPr>
+                  </pic:nvPicPr>
+                  <pic:blipFill>
+                    <a:blip r:embed="rId48">
+                      <a:extLst>
+                        <a:ext uri="{28A0092B-C50C-407E-A947-70E740481C1C}">
+                          <a14:useLocalDpi xmlns:a14="http://schemas.microsoft.com/office/drawing/2010/main" val="0"/>
+                        </a:ext>
+                      </a:extLst>
+                    </a:blip>
+                    <a:srcRect/>
+                    <a:stretch>
+                      <a:fillRect/>
+                    </a:stretch>
+                  </pic:blipFill>
+                  <pic:spPr bwMode="auto">
+                    <a:xfrm>
+                      <a:off x="0" y="0"/>
+                      <a:ext cx="5943600" cy="2419350"/>
+                    </a:xfrm>
+                    <a:prstGeom prst="rect">
+                      <a:avLst/>
+                    </a:prstGeom>
+                    <a:noFill/>
+                    <a:ln>
+                      <a:noFill/>
+                    </a:ln>
+                  </pic:spPr>
+                </pic:pic>
+              </a:graphicData>
+            </a:graphic>
+          </wp:inline>
+        </w:drawing>
+      </w:r>
+    </w:p>
+    <w:p>
+      <w:pPr>
+        <w:pStyle w:val="Heading2"/>
+        <w:rPr>
+          <w:rFonts w:ascii="Times New Roman" w:hAnsi="Times New Roman" w:cs="Times New Roman"/>
+          <w:color w:val="auto"/>
+          <w:sz w:val="24"/>
+          <w:szCs w:val="24"/>
+        </w:rPr>
+      </w:pPr>
+      <w:bookmarkStart w:id="53" w:name="_Toc233315807"/>
+      <w:r>
+        <w:rPr>
+          <w:rFonts w:ascii="Times New Roman" w:hAnsi="Times New Roman" w:cs="Times New Roman"/>
+          <w:color w:val="auto"/>
+          <w:sz w:val="24"/>
+          <w:szCs w:val="24"/>
+        </w:rPr>
+        <w:t>Fig 1- Installation Output</w:t>
+      </w:r>
+      <w:bookmarkEnd w:id="53"/>
+    </w:p>
+    <w:p>
+      <w:pPr>
+        <w:rPr>
+          <w:rFonts w:ascii="Times New Roman" w:hAnsi="Times New Roman" w:cs="Times New Roman"/>
+          <w:sz w:val="24"/>
+          <w:szCs w:val="24"/>
+          <w:lang w:val="en-KE"/>
+        </w:rPr>
+      </w:pPr>
+      <w:r>
+        <w:rPr>
+          <w:rFonts w:ascii="Times New Roman" w:hAnsi="Times New Roman" w:cs="Times New Roman"/>
+          <w:noProof/>
+          <w:sz w:val="24"/>
+          <w:szCs w:val="24"/>
+          <w:lang w:val="en-KE"/>
+        </w:rPr>
+        <w:drawing>
+          <wp:inline distT="0" distB="0" distL="0" distR="0" wp14:anchorId="4EA67EE1" wp14:editId="30063FF6">
+            <wp:extent cx="5943600" cy="2827020"/>
+            <wp:effectExtent l="0" t="0" r="0" b="0"/>
+            <wp:docPr id="555945782" name="Picture 4"/>
+            <wp:cNvGraphicFramePr>
+              <a:graphicFrameLocks xmlns:a="http://schemas.openxmlformats.org/drawingml/2006/main" noChangeAspect="1"/>
+            </wp:cNvGraphicFramePr>
+            <a:graphic xmlns:a="http://schemas.openxmlformats.org/drawingml/2006/main">
+              <a:graphicData uri="http://schemas.openxmlformats.org/drawingml/2006/picture">
+                <pic:pic xmlns:pic="http://schemas.openxmlformats.org/drawingml/2006/picture">
+                  <pic:nvPicPr>
+                    <pic:cNvPr id="0" name="Picture 3"/>
+                    <pic:cNvPicPr>
+                      <a:picLocks noChangeAspect="1" noChangeArrowheads="1"/>
+                    </pic:cNvPicPr>
+                  </pic:nvPicPr>
+                  <pic:blipFill>
+                    <a:blip r:embed="rId49" cstate="print">
+                      <a:extLst>
+                        <a:ext uri="{28A0092B-C50C-407E-A947-70E740481C1C}">
+                          <a14:useLocalDpi xmlns:a14="http://schemas.microsoft.com/office/drawing/2010/main" val="0"/>
+                        </a:ext>
+                      </a:extLst>
+                    </a:blip>
+                    <a:srcRect/>
+                    <a:stretch>
+                      <a:fillRect/>
+                    </a:stretch>
+                  </pic:blipFill>
+                  <pic:spPr bwMode="auto">
+                    <a:xfrm>
+                      <a:off x="0" y="0"/>
+                      <a:ext cx="5943600" cy="2827020"/>
+                    </a:xfrm>
+                    <a:prstGeom prst="rect">
+                      <a:avLst/>
+                    </a:prstGeom>
+                    <a:noFill/>
+                    <a:ln>
+                      <a:noFill/>
+                    </a:ln>
+                  </pic:spPr>
+                </pic:pic>
+              </a:graphicData>
+            </a:graphic>
+          </wp:inline>
+        </w:drawing>
+      </w:r>
+    </w:p>
+    <w:p>
+      <w:pPr>
+        <w:rPr>
+          <w:rFonts w:ascii="Times New Roman" w:hAnsi="Times New Roman" w:cs="Times New Roman"/>
+          <w:sz w:val="24"/>
+          <w:szCs w:val="24"/>
+        </w:rPr>
+      </w:pPr>
+    </w:p>
+    <w:p>
+      <w:pPr>
+        <w:rPr>
+          <w:rFonts w:ascii="Times New Roman" w:hAnsi="Times New Roman" w:cs="Times New Roman"/>
+          <w:sz w:val="24"/>
+          <w:szCs w:val="24"/>
+        </w:rPr>
+      </w:pPr>
+    </w:p>
+    <w:p>
+      <w:pPr>
+        <w:rPr>
+          <w:rFonts w:ascii="Times New Roman" w:hAnsi="Times New Roman" w:cs="Times New Roman"/>
+          <w:sz w:val="24"/>
+          <w:szCs w:val="24"/>
+          <w:lang w:val="en-KE"/>
+        </w:rPr>
+      </w:pPr>
+      <w:r>
+        <w:rPr>
+          <w:rFonts w:ascii="Times New Roman" w:hAnsi="Times New Roman" w:cs="Times New Roman"/>
+          <w:noProof/>
+          <w:sz w:val="24"/>
+          <w:szCs w:val="24"/>
+          <w:lang w:val="en-KE"/>
+        </w:rPr>
+        <w:lastRenderedPageBreak/>
+        <w:drawing>
+          <wp:inline distT="0" distB="0" distL="0" distR="0" wp14:anchorId="0EBA24C4" wp14:editId="59EE8F8F">
+            <wp:extent cx="5943600" cy="2912745"/>
+            <wp:effectExtent l="0" t="0" r="0" b="1905"/>
+            <wp:docPr id="1460669213" name="Picture 5"/>
+            <wp:cNvGraphicFramePr>
+              <a:graphicFrameLocks xmlns:a="http://schemas.openxmlformats.org/drawingml/2006/main" noChangeAspect="1"/>
+            </wp:cNvGraphicFramePr>
+            <a:graphic xmlns:a="http://schemas.openxmlformats.org/drawingml/2006/main">
+              <a:graphicData uri="http://schemas.openxmlformats.org/drawingml/2006/picture">
+                <pic:pic xmlns:pic="http://schemas.openxmlformats.org/drawingml/2006/picture">
+                  <pic:nvPicPr>
+                    <pic:cNvPr id="0" name="Picture 5"/>
+                    <pic:cNvPicPr>
+                      <a:picLocks noChangeAspect="1" noChangeArrowheads="1"/>
+                    </pic:cNvPicPr>
+                  </pic:nvPicPr>
+                  <pic:blipFill>
+                    <a:blip r:embed="rId50" cstate="print">
+                      <a:extLst>
+                        <a:ext uri="{28A0092B-C50C-407E-A947-70E740481C1C}">
+                          <a14:useLocalDpi xmlns:a14="http://schemas.microsoft.com/office/drawing/2010/main" val="0"/>
+                        </a:ext>
+                      </a:extLst>
+                    </a:blip>
+                    <a:srcRect/>
+                    <a:stretch>
+                      <a:fillRect/>
+                    </a:stretch>
+                  </pic:blipFill>
+                  <pic:spPr bwMode="auto">
+                    <a:xfrm>
+                      <a:off x="0" y="0"/>
+                      <a:ext cx="5943600" cy="2912745"/>
+                    </a:xfrm>
+                    <a:prstGeom prst="rect">
+                      <a:avLst/>
+                    </a:prstGeom>
+                    <a:noFill/>
+                    <a:ln>
+                      <a:noFill/>
+                    </a:ln>
+                  </pic:spPr>
+                </pic:pic>
+              </a:graphicData>
+            </a:graphic>
+          </wp:inline>
+        </w:drawing>
+      </w:r>
+    </w:p>
+    <w:p>
+      <w:pPr>
+        <w:rPr>
+          <w:rFonts w:ascii="Times New Roman" w:hAnsi="Times New Roman" w:cs="Times New Roman"/>
+          <w:sz w:val="24"/>
+          <w:szCs w:val="24"/>
+        </w:rPr>
+      </w:pPr>
+    </w:p>
+    <w:p>
+      <w:pPr>
+        <w:rPr>
+          <w:rFonts w:ascii="Times New Roman" w:hAnsi="Times New Roman" w:cs="Times New Roman"/>
+          <w:sz w:val="24"/>
+          <w:szCs w:val="24"/>
+          <w:lang w:val="en-KE"/>
+        </w:rPr>
+      </w:pPr>
+      <w:r>
+        <w:rPr>
+          <w:rFonts w:ascii="Times New Roman" w:hAnsi="Times New Roman" w:cs="Times New Roman"/>
+          <w:noProof/>
+          <w:sz w:val="24"/>
+          <w:szCs w:val="24"/>
+          <w:lang w:val="en-KE"/>
+        </w:rPr>
+        <w:drawing>
+          <wp:inline distT="0" distB="0" distL="0" distR="0" wp14:anchorId="33619A9D" wp14:editId="48130B56">
+            <wp:extent cx="5943600" cy="3037205"/>
+            <wp:effectExtent l="0" t="0" r="0" b="0"/>
+            <wp:docPr id="407597837" name="Picture 6"/>
+            <wp:cNvGraphicFramePr>
+              <a:graphicFrameLocks xmlns:a="http://schemas.openxmlformats.org/drawingml/2006/main" noChangeAspect="1"/>
+            </wp:cNvGraphicFramePr>
+            <a:graphic xmlns:a="http://schemas.openxmlformats.org/drawingml/2006/main">
+              <a:graphicData uri="http://schemas.openxmlformats.org/drawingml/2006/picture">
+                <pic:pic xmlns:pic="http://schemas.openxmlformats.org/drawingml/2006/picture">
+                  <pic:nvPicPr>
+                    <pic:cNvPr id="0" name="Picture 7"/>
+                    <pic:cNvPicPr>
+                      <a:picLocks noChangeAspect="1" noChangeArrowheads="1"/>
+                    </pic:cNvPicPr>
+                  </pic:nvPicPr>
+                  <pic:blipFill>
+                    <a:blip r:embed="rId51">
+                      <a:extLst>
+                        <a:ext uri="{28A0092B-C50C-407E-A947-70E740481C1C}">
+                          <a14:useLocalDpi xmlns:a14="http://schemas.microsoft.com/office/drawing/2010/main" val="0"/>
+                        </a:ext>
+                      </a:extLst>
+                    </a:blip>
+                    <a:srcRect/>
+                    <a:stretch>
+                      <a:fillRect/>
+                    </a:stretch>
+                  </pic:blipFill>
+                  <pic:spPr bwMode="auto">
+                    <a:xfrm>
+                      <a:off x="0" y="0"/>
+                      <a:ext cx="5943600" cy="3037205"/>
+                    </a:xfrm>
+                    <a:prstGeom prst="rect">
+                      <a:avLst/>
+                    </a:prstGeom>
+                    <a:noFill/>
+                    <a:ln>
+                      <a:noFill/>
+                    </a:ln>
+                  </pic:spPr>
+                </pic:pic>
+              </a:graphicData>
+            </a:graphic>
+          </wp:inline>
+        </w:drawing>
+      </w:r>
+    </w:p>
+    <w:p>
+      <w:pPr>
+        <w:pStyle w:val="Heading2"/>
+        <w:rPr>
+          <w:rFonts w:ascii="Times New Roman" w:hAnsi="Times New Roman" w:cs="Times New Roman"/>
+          <w:color w:val="auto"/>
+          <w:sz w:val="24"/>
+          <w:szCs w:val="24"/>
+        </w:rPr>
+      </w:pPr>
+      <w:bookmarkStart w:id="54" w:name="_Toc233315808"/>
+      <w:r>
+        <w:rPr>
+          <w:rFonts w:ascii="Times New Roman" w:hAnsi="Times New Roman" w:cs="Times New Roman"/>
+          <w:color w:val="auto"/>
+          <w:sz w:val="24"/>
+          <w:szCs w:val="24"/>
+        </w:rPr>
+        <w:lastRenderedPageBreak/>
+        <w:t>Fig 2- Sentiment Analysis Output</w:t>
+      </w:r>
+      <w:bookmarkEnd w:id="54"/>
+    </w:p>
+    <w:p>
+      <w:pPr>
+        <w:rPr>
+          <w:rFonts w:ascii="Times New Roman" w:hAnsi="Times New Roman" w:cs="Times New Roman"/>
+          <w:sz w:val="24"/>
+          <w:szCs w:val="24"/>
+          <w:lang w:val="en-KE"/>
+        </w:rPr>
+      </w:pPr>
+      <w:r>
+        <w:rPr>
+          <w:rFonts w:ascii="Times New Roman" w:hAnsi="Times New Roman" w:cs="Times New Roman"/>
+          <w:noProof/>
+          <w:sz w:val="24"/>
+          <w:szCs w:val="24"/>
+          <w:lang w:val="en-KE"/>
+        </w:rPr>
+        <w:drawing>
+          <wp:inline distT="0" distB="0" distL="0" distR="0" wp14:anchorId="1C641AD5" wp14:editId="19AFA772">
+            <wp:extent cx="5943600" cy="2575560"/>
+            <wp:effectExtent l="0" t="0" r="0" b="0"/>
+            <wp:docPr id="294142026" name="Picture 7"/>
+            <wp:cNvGraphicFramePr>
+              <a:graphicFrameLocks xmlns:a="http://schemas.openxmlformats.org/drawingml/2006/main" noChangeAspect="1"/>
+            </wp:cNvGraphicFramePr>
+            <a:graphic xmlns:a="http://schemas.openxmlformats.org/drawingml/2006/main">
+              <a:graphicData uri="http://schemas.openxmlformats.org/drawingml/2006/picture">
+                <pic:pic xmlns:pic="http://schemas.openxmlformats.org/drawingml/2006/picture">
+                  <pic:nvPicPr>
+                    <pic:cNvPr id="0" name="Picture 9"/>
+                    <pic:cNvPicPr>
+                      <a:picLocks noChangeAspect="1" noChangeArrowheads="1"/>
+                    </pic:cNvPicPr>
+                  </pic:nvPicPr>
+                  <pic:blipFill>
+                    <a:blip r:embed="rId52" cstate="print">
+                      <a:extLst>
+                        <a:ext uri="{28A0092B-C50C-407E-A947-70E740481C1C}">
+                          <a14:useLocalDpi xmlns:a14="http://schemas.microsoft.com/office/drawing/2010/main" val="0"/>
+                        </a:ext>
+                      </a:extLst>
+                    </a:blip>
+                    <a:srcRect/>
+                    <a:stretch>
+                      <a:fillRect/>
+                    </a:stretch>
+                  </pic:blipFill>
+                  <pic:spPr bwMode="auto">
+                    <a:xfrm>
+                      <a:off x="0" y="0"/>
+                      <a:ext cx="5943600" cy="2575560"/>
+                    </a:xfrm>
+                    <a:prstGeom prst="rect">
+                      <a:avLst/>
+                    </a:prstGeom>
+                    <a:noFill/>
+                    <a:ln>
+                      <a:noFill/>
+                    </a:ln>
+                  </pic:spPr>
+                </pic:pic>
+              </a:graphicData>
+            </a:graphic>
+          </wp:inline>
+        </w:drawing>
+      </w:r>
+    </w:p>
+    <w:p>
+      <w:pPr>
+        <w:pStyle w:val="Heading2"/>
+        <w:rPr>
+          <w:rFonts w:ascii="Times New Roman" w:hAnsi="Times New Roman" w:cs="Times New Roman"/>
+          <w:color w:val="auto"/>
+          <w:sz w:val="24"/>
+          <w:szCs w:val="24"/>
+        </w:rPr>
+      </w:pPr>
+      <w:bookmarkStart w:id="55" w:name="_Toc233315809"/>
+      <w:r>
+        <w:rPr>
+          <w:rFonts w:ascii="Times New Roman" w:hAnsi="Times New Roman" w:cs="Times New Roman"/>
+          <w:color w:val="auto"/>
+          <w:sz w:val="24"/>
+          <w:szCs w:val="24"/>
+        </w:rPr>
+        <w:t>Fig 3- Sentiment Confidence Chart</w:t>
+      </w:r>
+      <w:bookmarkEnd w:id="55"/>
+    </w:p>
+    <w:p>
+      <w:pPr>
+        <w:rPr>
+          <w:rFonts w:ascii="Times New Roman" w:hAnsi="Times New Roman" w:cs="Times New Roman"/>
+          <w:sz w:val="24"/>
+          <w:szCs w:val="24"/>
+        </w:rPr>
+      </w:pPr>
+    </w:p>
+    <w:p>
+      <w:pPr>
+        <w:rPr>
+          <w:rFonts w:ascii="Times New Roman" w:hAnsi="Times New Roman" w:cs="Times New Roman"/>
+          <w:sz w:val="24"/>
+          <w:szCs w:val="24"/>
+          <w:lang w:val="en-KE"/>
+        </w:rPr>
+      </w:pPr>
+      <w:r>
+        <w:rPr>
+          <w:rFonts w:ascii="Times New Roman" w:hAnsi="Times New Roman" w:cs="Times New Roman"/>
+          <w:noProof/>
+          <w:sz w:val="24"/>
+          <w:szCs w:val="24"/>
+          <w:lang w:val="en-KE"/>
+        </w:rPr>
+        <w:drawing>
+          <wp:inline distT="0" distB="0" distL="0" distR="0" wp14:anchorId="53ED3657" wp14:editId="59C44742">
+            <wp:extent cx="5943600" cy="2625725"/>
+            <wp:effectExtent l="0" t="0" r="0" b="3175"/>
+            <wp:docPr id="899492177" name="Picture 8"/>
+            <wp:cNvGraphicFramePr>
+              <a:graphicFrameLocks xmlns:a="http://schemas.openxmlformats.org/drawingml/2006/main" noChangeAspect="1"/>
+            </wp:cNvGraphicFramePr>
+            <a:graphic xmlns:a="http://schemas.openxmlformats.org/drawingml/2006/main">
+              <a:graphicData uri="http://schemas.openxmlformats.org/drawingml/2006/picture">
+                <pic:pic xmlns:pic="http://schemas.openxmlformats.org/drawingml/2006/picture">
+                  <pic:nvPicPr>
+                    <pic:cNvPr id="0" name="Picture 11"/>
+                    <pic:cNvPicPr>
+                      <a:picLocks noChangeAspect="1" noChangeArrowheads="1"/>
+                    </pic:cNvPicPr>
+                  </pic:nvPicPr>
+                  <pic:blipFill>
+                    <a:blip r:embed="rId53" cstate="print">
+                      <a:extLst>
+                        <a:ext uri="{28A0092B-C50C-407E-A947-70E740481C1C}">
+                          <a14:useLocalDpi xmlns:a14="http://schemas.microsoft.com/office/drawing/2010/main" val="0"/>
+                        </a:ext>
+                      </a:extLst>
+                    </a:blip>
+                    <a:srcRect/>
+                    <a:stretch>
+                      <a:fillRect/>
+                    </a:stretch>
+                  </pic:blipFill>
+                  <pic:spPr bwMode="auto">
+                    <a:xfrm>
+                      <a:off x="0" y="0"/>
+                      <a:ext cx="5943600" cy="2625725"/>
+                    </a:xfrm>
+                    <a:prstGeom prst="rect">
+                      <a:avLst/>
+                    </a:prstGeom>
+                    <a:noFill/>
+                    <a:ln>
+                      <a:noFill/>
+                    </a:ln>
+                  </pic:spPr>
+                </pic:pic>
+              </a:graphicData>
+            </a:graphic>
+          </wp:inline>
+        </w:drawing>
+      </w:r>
+    </w:p>
+    <w:p>
+      <w:pPr>
+        <w:pStyle w:val="Heading2"/>
+        <w:rPr>
+          <w:rFonts w:ascii="Times New Roman" w:hAnsi="Times New Roman" w:cs="Times New Roman"/>
+          <w:color w:val="auto"/>
+          <w:sz w:val="24"/>
+          <w:szCs w:val="24"/>
+        </w:rPr>
+      </w:pPr>
+      <w:bookmarkStart w:id="56" w:name="_Toc233315810"/>
+      <w:r>
+        <w:rPr>
+          <w:rFonts w:ascii="Times New Roman" w:hAnsi="Times New Roman" w:cs="Times New Roman"/>
+          <w:color w:val="auto"/>
+          <w:sz w:val="24"/>
+          <w:szCs w:val="24"/>
+        </w:rPr>
+        <w:lastRenderedPageBreak/>
+        <w:t>Fig 4- GPT-2 Text Generation Output</w:t>
+      </w:r>
+      <w:bookmarkEnd w:id="56"/>
+    </w:p>
+    <w:p>
+      <w:pPr>
+        <w:rPr>
+          <w:rFonts w:ascii="Times New Roman" w:hAnsi="Times New Roman" w:cs="Times New Roman"/>
+          <w:sz w:val="24"/>
+          <w:szCs w:val="24"/>
+          <w:lang w:val="en-KE"/>
+        </w:rPr>
+      </w:pPr>
+      <w:r>
+        <w:rPr>
+          <w:rFonts w:ascii="Times New Roman" w:hAnsi="Times New Roman" w:cs="Times New Roman"/>
+          <w:noProof/>
+          <w:sz w:val="24"/>
+          <w:szCs w:val="24"/>
+          <w:lang w:val="en-KE"/>
+        </w:rPr>
+        <w:drawing>
+          <wp:inline distT="0" distB="0" distL="0" distR="0" wp14:anchorId="79BE787C" wp14:editId="10A6602D">
+            <wp:extent cx="5943600" cy="2421890"/>
+            <wp:effectExtent l="0" t="0" r="0" b="0"/>
+            <wp:docPr id="943985244" name="Picture 9"/>
+            <wp:cNvGraphicFramePr>
+              <a:graphicFrameLocks xmlns:a="http://schemas.openxmlformats.org/drawingml/2006/main" noChangeAspect="1"/>
+            </wp:cNvGraphicFramePr>
+            <a:graphic xmlns:a="http://schemas.openxmlformats.org/drawingml/2006/main">
+              <a:graphicData uri="http://schemas.openxmlformats.org/drawingml/2006/picture">
+                <pic:pic xmlns:pic="http://schemas.openxmlformats.org/drawingml/2006/picture">
+                  <pic:nvPicPr>
+                    <pic:cNvPr id="0" name="Picture 13"/>
+                    <pic:cNvPicPr>
+                      <a:picLocks noChangeAspect="1" noChangeArrowheads="1"/>
+                    </pic:cNvPicPr>
+                  </pic:nvPicPr>
+                  <pic:blipFill>
+                    <a:blip r:embed="rId54" cstate="print">
+                      <a:extLst>
+                        <a:ext uri="{28A0092B-C50C-407E-A947-70E740481C1C}">
+                          <a14:useLocalDpi xmlns:a14="http://schemas.microsoft.com/office/drawing/2010/main" val="0"/>
+                        </a:ext>
+                      </a:extLst>
+                    </a:blip>
+                    <a:srcRect/>
+                    <a:stretch>
+                      <a:fillRect/>
+                    </a:stretch>
+                  </pic:blipFill>
+                  <pic:spPr bwMode="auto">
+                    <a:xfrm>
+                      <a:off x="0" y="0"/>
+                      <a:ext cx="5943600" cy="2421890"/>
+                    </a:xfrm>
+                    <a:prstGeom prst="rect">
+                      <a:avLst/>
+                    </a:prstGeom>
+                    <a:noFill/>
+                    <a:ln>
+                      <a:noFill/>
+                    </a:ln>
+                  </pic:spPr>
+                </pic:pic>
+              </a:graphicData>
+            </a:graphic>
+          </wp:inline>
+        </w:drawing>
+      </w:r>
+    </w:p>
+    <w:p>
+      <w:pPr>
+        <w:rPr>
+          <w:rFonts w:ascii="Times New Roman" w:hAnsi="Times New Roman" w:cs="Times New Roman"/>
+          <w:sz w:val="24"/>
+          <w:szCs w:val="24"/>
+        </w:rPr>
+      </w:pPr>
+    </w:p>
+    <w:p>
+      <w:pPr>
+        <w:rPr>
+          <w:rFonts w:ascii="Times New Roman" w:hAnsi="Times New Roman" w:cs="Times New Roman"/>
+          <w:sz w:val="24"/>
+          <w:szCs w:val="24"/>
+          <w:lang w:val="en-KE"/>
+        </w:rPr>
+      </w:pPr>
+      <w:r>
+        <w:rPr>
+          <w:rFonts w:ascii="Times New Roman" w:hAnsi="Times New Roman" w:cs="Times New Roman"/>
+          <w:noProof/>
+          <w:sz w:val="24"/>
+          <w:szCs w:val="24"/>
+          <w:lang w:val="en-KE"/>
+        </w:rPr>
+        <w:drawing>
+          <wp:inline distT="0" distB="0" distL="0" distR="0" wp14:anchorId="387F9CDF" wp14:editId="4F5BD27A">
+            <wp:extent cx="5943600" cy="2313940"/>
+            <wp:effectExtent l="0" t="0" r="0" b="0"/>
+            <wp:docPr id="244875779" name="Picture 10"/>
+            <wp:cNvGraphicFramePr>
+              <a:graphicFrameLocks xmlns:a="http://schemas.openxmlformats.org/drawingml/2006/main" noChangeAspect="1"/>
+            </wp:cNvGraphicFramePr>
+            <a:graphic xmlns:a="http://schemas.openxmlformats.org/drawingml/2006/main">
+              <a:graphicData uri="http://schemas.openxmlformats.org/drawingml/2006/picture">
+                <pic:pic xmlns:pic="http://schemas.openxmlformats.org/drawingml/2006/picture">
+                  <pic:nvPicPr>
+                    <pic:cNvPr id="0" name="Picture 15"/>
+                    <pic:cNvPicPr>
+                      <a:picLocks noChangeAspect="1" noChangeArrowheads="1"/>
+                    </pic:cNvPicPr>
+                  </pic:nvPicPr>
+                  <pic:blipFill>
+                    <a:blip r:embed="rId55" cstate="print">
+                      <a:extLst>
+                        <a:ext uri="{28A0092B-C50C-407E-A947-70E740481C1C}">
+                          <a14:useLocalDpi xmlns:a14="http://schemas.microsoft.com/office/drawing/2010/main" val="0"/>
+                        </a:ext>
+                      </a:extLst>
+                    </a:blip>
+                    <a:srcRect/>
+                    <a:stretch>
+                      <a:fillRect/>
+                    </a:stretch>
+                  </pic:blipFill>
+                  <pic:spPr bwMode="auto">
+                    <a:xfrm>
+                      <a:off x="0" y="0"/>
+                      <a:ext cx="5943600" cy="2313940"/>
+                    </a:xfrm>
+                    <a:prstGeom prst="rect">
+                      <a:avLst/>
+                    </a:prstGeom>
+                    <a:noFill/>
+                    <a:ln>
+                      <a:noFill/>
+                    </a:ln>
+                  </pic:spPr>
+                </pic:pic>
+              </a:graphicData>
+            </a:graphic>
+          </wp:inline>
+        </w:drawing>
+      </w:r>
+    </w:p>
+    <w:p>
+      <w:pPr>
+        <w:pStyle w:val="Heading2"/>
+        <w:rPr>
+          <w:rFonts w:ascii="Times New Roman" w:hAnsi="Times New Roman" w:cs="Times New Roman"/>
+          <w:color w:val="auto"/>
+          <w:sz w:val="24"/>
+          <w:szCs w:val="24"/>
+        </w:rPr>
+      </w:pPr>
+      <w:bookmarkStart w:id="57" w:name="_Toc233315811"/>
+      <w:r>
+        <w:rPr>
+          <w:rFonts w:ascii="Times New Roman" w:hAnsi="Times New Roman" w:cs="Times New Roman"/>
+          <w:color w:val="auto"/>
+          <w:sz w:val="24"/>
+          <w:szCs w:val="24"/>
+        </w:rPr>
+        <w:t>Fig 5- Text Generation with Different Lengths</w:t>
+      </w:r>
+      <w:bookmarkEnd w:id="57"/>
+    </w:p>
+    <w:p>
+      <w:pPr>
+        <w:rPr>
+          <w:rFonts w:ascii="Times New Roman" w:hAnsi="Times New Roman" w:cs="Times New Roman"/>
+          <w:sz w:val="24"/>
+          <w:szCs w:val="24"/>
+        </w:rPr>
+      </w:pPr>
+    </w:p>
+    <w:p>
+      <w:pPr>
+        <w:pStyle w:val="Heading2"/>
+        <w:rPr>
+          <w:rFonts w:ascii="Times New Roman" w:hAnsi="Times New Roman" w:cs="Times New Roman"/>
+          <w:color w:val="auto"/>
+          <w:sz w:val="24"/>
+          <w:szCs w:val="24"/>
+        </w:rPr>
+      </w:pPr>
+      <w:bookmarkStart w:id="58" w:name="_Toc233315812"/>
+      <w:r>
+        <w:rPr>
+          <w:rFonts w:ascii="Times New Roman" w:hAnsi="Times New Roman" w:cs="Times New Roman"/>
+          <w:color w:val="auto"/>
+          <w:sz w:val="24"/>
+          <w:szCs w:val="24"/>
+        </w:rPr>
+        <w:t>WEEK 8 REFLECTION</w:t>
+      </w:r>
+      <w:bookmarkEnd w:id="58"/>
+    </w:p>
+    <w:p>
+      <w:pPr>
+        <w:rPr>
+          <w:rFonts w:ascii="Times New Roman" w:hAnsi="Times New Roman" w:cs="Times New Roman"/>
+          <w:sz w:val="24"/>
+          <w:szCs w:val="24"/>
+        </w:rPr>
+      </w:pPr>
+      <w:r>
+        <w:rPr>
+          <w:rFonts w:ascii="Times New Roman" w:hAnsi="Times New Roman" w:cs="Times New Roman"/>
+          <w:sz w:val="24"/>
+          <w:szCs w:val="24"/>
+        </w:rPr>
+        <w:t>I</w:t>
+      </w:r>
+      <w:r>
+        <w:rPr>
+          <w:rFonts w:ascii="Times New Roman" w:hAnsi="Times New Roman" w:cs="Times New Roman"/>
+          <w:sz w:val="24"/>
+          <w:szCs w:val="24"/>
+        </w:rPr>
+        <w:t xml:space="preserve"> introduced Transformer models, the architecture behind ChatGPT, Google Translate and Grammarly and </w:t>
+      </w:r>
+      <w:r>
+        <w:rPr>
+          <w:rFonts w:ascii="Times New Roman" w:hAnsi="Times New Roman" w:cs="Times New Roman"/>
+          <w:sz w:val="24"/>
+          <w:szCs w:val="24"/>
+        </w:rPr>
+        <w:t>I</w:t>
+      </w:r>
+      <w:r>
+        <w:rPr>
+          <w:rFonts w:ascii="Times New Roman" w:hAnsi="Times New Roman" w:cs="Times New Roman"/>
+          <w:sz w:val="24"/>
+          <w:szCs w:val="24"/>
+        </w:rPr>
+        <w:t xml:space="preserve"> saw them in action in Practical Task 1 when </w:t>
+      </w:r>
+      <w:proofErr w:type="spellStart"/>
+      <w:r>
+        <w:rPr>
+          <w:rFonts w:ascii="Times New Roman" w:hAnsi="Times New Roman" w:cs="Times New Roman"/>
+          <w:sz w:val="24"/>
+          <w:szCs w:val="24"/>
+        </w:rPr>
+        <w:t>DistilBERT</w:t>
+      </w:r>
+      <w:proofErr w:type="spellEnd"/>
+      <w:r>
+        <w:rPr>
+          <w:rFonts w:ascii="Times New Roman" w:hAnsi="Times New Roman" w:cs="Times New Roman"/>
+          <w:sz w:val="24"/>
+          <w:szCs w:val="24"/>
+        </w:rPr>
+        <w:t xml:space="preserve"> had a confidence score of more than 99% in some cases to make the sentiment analysis prediction. In Practical Task 2</w:t>
+      </w:r>
+      <w:r>
+        <w:rPr>
+          <w:rFonts w:ascii="Times New Roman" w:hAnsi="Times New Roman" w:cs="Times New Roman"/>
+          <w:sz w:val="24"/>
+          <w:szCs w:val="24"/>
+        </w:rPr>
+        <w:t xml:space="preserve"> I</w:t>
+      </w:r>
+      <w:r>
+        <w:rPr>
+          <w:rFonts w:ascii="Times New Roman" w:hAnsi="Times New Roman" w:cs="Times New Roman"/>
+          <w:sz w:val="24"/>
+          <w:szCs w:val="24"/>
+        </w:rPr>
+        <w:t xml:space="preserve"> saw how a decoder-only model was used to extend text with GPT-2, generating coherent continuations of sentences from various prompts. Connecting Transformers back to the main SMS Spam project, </w:t>
+      </w:r>
+      <w:r>
+        <w:rPr>
+          <w:rFonts w:ascii="Times New Roman" w:hAnsi="Times New Roman" w:cs="Times New Roman"/>
+          <w:sz w:val="24"/>
+          <w:szCs w:val="24"/>
+        </w:rPr>
+        <w:t>I</w:t>
+      </w:r>
+      <w:r>
+        <w:rPr>
+          <w:rFonts w:ascii="Times New Roman" w:hAnsi="Times New Roman" w:cs="Times New Roman"/>
+          <w:sz w:val="24"/>
+          <w:szCs w:val="24"/>
+        </w:rPr>
+        <w:t xml:space="preserve"> saw how BERT could be used to classify sentences without any training data using zero-shot classification.</w:t>
+      </w:r>
+    </w:p>
+    <w:p>
+      <w:pPr>
+        <w:rPr>
+          <w:rFonts w:ascii="Times New Roman" w:hAnsi="Times New Roman" w:cs="Times New Roman"/>
+          <w:sz w:val="24"/>
+          <w:szCs w:val="24"/>
+        </w:rPr>
+      </w:pPr>
+    </w:p>
+    <w:p>
+      <w:pPr>
+        <w:rPr>
+          <w:rFonts w:ascii="Times New Roman" w:hAnsi="Times New Roman" w:cs="Times New Roman"/>
+          <w:sz w:val="24"/>
+          <w:szCs w:val="24"/>
+        </w:rPr>
+      </w:pPr>
     </w:p>
     <w:p>
       <w:pPr>
@@ -10486,6 +11583,7 @@
   <w:style w:type="character" w:default="1" w:styleId="DefaultParagraphFont">
     <w:name w:val="Default Paragraph Font"/>
     <w:uiPriority w:val="1"/>
+    <w:semiHidden/>
     <w:unhideWhenUsed/>
   </w:style>
   <w:style w:type="table" w:default="1" w:styleId="TableNormal">

</xml_diff>